<commit_message>
backup: tự động 23/09/2026 07:23 (8 tệp)
</commit_message>
<xml_diff>
--- a/30-Ket-Qua/2026-09-21/De-cuong-Hang-A/De_cuong_De_an_Hang_A_dieu-chinh-van-phong-Dang-kiem-TC_20260921.docx
+++ b/30-Ket-Qua/2026-09-21/De-cuong-Hang-A/De_cuong_De_an_Hang_A_dieu-chinh-van-phong-Dang-kiem-TC_20260921.docx
@@ -112,7 +112,7 @@
               </wp:anchor>
             </w:drawing>
           </mc:Choice>
-          <mc:Fallback xmlns:w16sdtfl="http://schemas.microsoft.com/office/word/2024/wordml/sdtformatlock" xmlns:w16cei="http://schemas.microsoft.com/office/word/2026/wordml/cei">
+          <mc:Fallback xmlns:w16cei="http://schemas.microsoft.com/office/word/2026/wordml/cei" xmlns:w16sdtfl="http://schemas.microsoft.com/office/word/2024/wordml/sdtformatlock">
             <w:pict>
               <v:line w14:anchorId="65672478" id="Straight Connector 3" o:spid="_x0000_s1026" style="position:absolute;z-index:251661312;visibility:visible;mso-wrap-style:square;mso-width-percent:0;mso-wrap-distance-left:9pt;mso-wrap-distance-top:0;mso-wrap-distance-right:9pt;mso-wrap-distance-bottom:0;mso-position-horizontal:absolute;mso-position-horizontal-relative:margin;mso-position-vertical:absolute;mso-position-vertical-relative:text;mso-width-percent:0;mso-width-relative:margin" from="181.25pt,2.85pt" to="267.45pt,2.85pt" o:gfxdata="UEsDBBQABgAIAAAAIQC2gziS/gAAAOEBAAATAAAAW0NvbnRlbnRfVHlwZXNdLnhtbJSRQU7DMBBF 90jcwfIWJU67QAgl6YK0S0CoHGBkTxKLZGx5TGhvj5O2G0SRWNoz/78nu9wcxkFMGNg6quQqL6RA 0s5Y6ir5vt9lD1JwBDIwOMJKHpHlpr69KfdHjyxSmriSfYz+USnWPY7AufNIadK6MEJMx9ApD/oD OlTrorhX2lFEilmcO2RdNtjC5xDF9pCuTyYBB5bi6bQ4syoJ3g9WQ0ymaiLzg5KdCXlKLjvcW893 SUOqXwnz5DrgnHtJTxOsQfEKIT7DmDSUCaxw7Rqn8787ZsmRM9e2VmPeBN4uqYvTtW7jvijg9N/y JsXecLq0q+WD6m8AAAD//wMAUEsDBBQABgAIAAAAIQA4/SH/1gAAAJQBAAALAAAAX3JlbHMvLnJl bHOkkMFqwzAMhu+DvYPRfXGawxijTi+j0GvpHsDYimMaW0Yy2fr2M4PBMnrbUb/Q94l/f/hMi1qR JVI2sOt6UJgd+ZiDgffL8ekFlFSbvV0oo4EbChzGx4f9GRdb25HMsYhqlCwG5lrLq9biZkxWOiqY 22YiTra2kYMu1l1tQD30/bPm3wwYN0x18gb45AdQl1tp5j/sFB2T0FQ7R0nTNEV3j6o9feQzro1i OWA14Fm+Q8a1a8+Bvu/d/dMb2JY5uiPbhG/ktn4cqGU/er3pcvwCAAD//wMAUEsDBBQABgAIAAAA IQDWRsVQmQEAAIgDAAAOAAAAZHJzL2Uyb0RvYy54bWysU9uO0zAQfUfiHyy/06TLCi1R033YFbwg WHH5AK8zbqy1PdbYNOnfM3bbFAFCCO2L48s5Z+bMTDa3s3diD5Qshl6uV60UEDQONux6+e3ru1c3 UqSswqAcBujlAZK83b58sZliB1c4ohuABIuE1E2xl2POsWuapEfwKq0wQuBHg+RV5iPtmoHUxOre NVdt+6aZkIZIqCElvr0/Pspt1TcGdP5kTIIsXC85t1xXqutjWZvtRnU7UnG0+pSG+o8svLKBgy5S 9yor8Z3sb1LeasKEJq80+gaNsRqqB3azbn9x82VUEaoXLk6KS5nS88nqj/u78EBchimmLsUHKi5m Q758OT8x12IdlmLBnIXmy3X79vrm9bUU+vzWXIiRUn4P6EXZ9NLZUHyoTu0/pMzBGHqG8OESuu7y wUEBu/AZjLBDCVbZdSrgzpHYK+7n8LQu/WOtiiwUY51bSO3fSSdsoUGdlH8lLugaEUNeiN4GpD9F zfM5VXPEn10fvRbbjzgcaiNqObjd1dlpNMs8/Xyu9MsPtP0BAAD//wMAUEsDBBQABgAIAAAAIQAC oh1k3AAAAAcBAAAPAAAAZHJzL2Rvd25yZXYueG1sTI7BTsMwEETvSPyDtUjcqENKQhviVFUlhLgg msLdjbdOIF5HtpOGv8dwgeNoRm9euZlNzyZ0vrMk4HaRAENqrOpIC3g7PN6sgPkgScneEgr4Qg+b 6vKilIWyZ9rjVAfNIoR8IQW0IQwF575p0Ui/sANS7E7WGRlidJorJ88RbnqeJknOjewoPrRywF2L zWc9GgH9s5ve9U5v/fi0z+uP11P6cpiEuL6atw/AAs7hbww/+lEdquh0tCMpz3oByzzN4lRAdg8s 9tnybg3s+Jt5VfL//tU3AAAA//8DAFBLAQItABQABgAIAAAAIQC2gziS/gAAAOEBAAATAAAAAAAA AAAAAAAAAAAAAABbQ29udGVudF9UeXBlc10ueG1sUEsBAi0AFAAGAAgAAAAhADj9If/WAAAAlAEA AAsAAAAAAAAAAAAAAAAALwEAAF9yZWxzLy5yZWxzUEsBAi0AFAAGAAgAAAAhANZGxVCZAQAAiAMA AA4AAAAAAAAAAAAAAAAALgIAAGRycy9lMm9Eb2MueG1sUEsBAi0AFAAGAAgAAAAhAAKiHWTcAAAA BwEAAA8AAAAAAAAAAAAAAAAA8wMAAGRycy9kb3ducmV2LnhtbFBLBQYAAAAABAAEAPMAAAD8BAAA AAA= " strokecolor="black [3200]" strokeweight=".5pt">
                 <v:stroke joinstyle="miter"/>
@@ -216,7 +216,7 @@
           </mc:Choice>
           <mc:Fallback>
             <w:pict>
-              <v:rect w14:anchorId="0586C767" id="Rectangle 1" o:spid="_x0000_s1026" style="position:absolute;left:0;text-align:left;margin-left:134.95pt;margin-top:7.65pt;width:208pt;height:56.65pt;z-index:251672576;visibility:visible;mso-wrap-style:square;mso-wrap-distance-left:9pt;mso-wrap-distance-top:0;mso-wrap-distance-right:9pt;mso-wrap-distance-bottom:0;mso-position-horizontal:absolute;mso-position-horizontal-relative:text;mso-position-vertical:absolute;mso-position-vertical-relative:text;v-text-anchor:middle" o:gfxdata="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" fillcolor="#5b9bd5 [3204]" strokecolor="#1f4d78 [1604]" strokeweight="1pt">
+              <v:rect w14:anchorId="2B4E1053" id="Rectangle 1" o:spid="_x0000_s1026" style="position:absolute;left:0;text-align:left;margin-left:134.95pt;margin-top:7.65pt;width:208pt;height:56.65pt;z-index:251672576;visibility:visible;mso-wrap-style:square;mso-wrap-distance-left:9pt;mso-wrap-distance-top:0;mso-wrap-distance-right:9pt;mso-wrap-distance-bottom:0;mso-position-horizontal:absolute;mso-position-horizontal-relative:text;mso-position-vertical:absolute;mso-position-vertical-relative:text;v-text-anchor:middle" o:gfxdata="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" fillcolor="#5b9bd5 [3204]" strokecolor="#1f4d78 [1604]" strokeweight="1pt">
                 <v:textbox>
                   <w:txbxContent>
                     <w:p>
@@ -535,30 +535,51 @@
       </w:pPr>
       <w:r>
         <w:rPr>
+          <w:b w:val="0"/>
           <w:color w:val="auto"/>
         </w:rPr>
         <w:fldChar w:fldCharType="begin"/>
       </w:r>
       <w:r>
         <w:rPr>
-          <w:color w:val="auto"/>
-        </w:rPr>
-        <w:instrText xml:space="preserve"> TOC \o "1-3" \h \z \u </w:instrText>
-      </w:r>
-      <w:r>
-        <w:rPr>
+          <w:b w:val="0"/>
+          <w:color w:val="auto"/>
+        </w:rPr>
+        <w:instrText xml:space="preserve"> TOC \o "1-3" \h \z \u \t "Heading 4,1" </w:instrText>
+      </w:r>
+      <w:r>
+        <w:rPr>
+          <w:b w:val="0"/>
           <w:color w:val="auto"/>
         </w:rPr>
         <w:fldChar w:fldCharType="separate"/>
       </w:r>
-      <w:hyperlink w:anchor="_Toc240873933" w:history="1">
+      <w:hyperlink w:anchor="_Toc240965908" w:history="1">
         <w:r>
           <w:rPr>
             <w:rStyle w:val="Hyperlink"/>
             <w:noProof/>
             <w:color w:val="auto"/>
           </w:rPr>
-          <w:t>I. SỰ CẦN THIẾT</w:t>
+          <w:t>Phần I</w:t>
+        </w:r>
+      </w:hyperlink>
+      <w:r>
+        <w:rPr>
+          <w:rStyle w:val="Hyperlink"/>
+          <w:noProof/>
+          <w:color w:val="auto"/>
+        </w:rPr>
+        <w:t xml:space="preserve">. </w:t>
+      </w:r>
+      <w:hyperlink w:anchor="_Toc240965909" w:history="1">
+        <w:r>
+          <w:rPr>
+            <w:rStyle w:val="Hyperlink"/>
+            <w:noProof/>
+            <w:color w:val="auto"/>
+          </w:rPr>
+          <w:t>SỰ CẦN THIẾT, CƠ SỞ XÂY DỰNG ĐỀ ÁN</w:t>
         </w:r>
         <w:r>
           <w:rPr>
@@ -582,7 +603,7 @@
             <w:webHidden/>
             <w:color w:val="auto"/>
           </w:rPr>
-          <w:instrText xml:space="preserve"> PAGEREF _Toc240873933 \h </w:instrText>
+          <w:instrText xml:space="preserve"> PAGEREF _Toc240965909 \h </w:instrText>
         </w:r>
         <w:r>
           <w:rPr>
@@ -631,14 +652,14 @@
           <w14:ligatures w14:val="standardContextual"/>
         </w:rPr>
       </w:pPr>
-      <w:hyperlink w:anchor="_Toc240873934" w:history="1">
+      <w:hyperlink w:anchor="_Toc240965910" w:history="1">
         <w:r>
           <w:rPr>
             <w:rStyle w:val="Hyperlink"/>
             <w:noProof/>
             <w:color w:val="auto"/>
           </w:rPr>
-          <w:t>II. CƠ SỞ XÂY DỰNG ĐỀ ÁN</w:t>
+          <w:t>I. SỰ CẦN THIẾT</w:t>
         </w:r>
         <w:r>
           <w:rPr>
@@ -662,7 +683,7 @@
             <w:webHidden/>
             <w:color w:val="auto"/>
           </w:rPr>
-          <w:instrText xml:space="preserve"> PAGEREF _Toc240873934 \h </w:instrText>
+          <w:instrText xml:space="preserve"> PAGEREF _Toc240965910 \h </w:instrText>
         </w:r>
         <w:r>
           <w:rPr>
@@ -685,7 +706,7 @@
             <w:webHidden/>
             <w:color w:val="auto"/>
           </w:rPr>
-          <w:t>2</w:t>
+          <w:t>1</w:t>
         </w:r>
         <w:r>
           <w:rPr>
@@ -711,14 +732,14 @@
           <w14:ligatures w14:val="standardContextual"/>
         </w:rPr>
       </w:pPr>
-      <w:hyperlink w:anchor="_Toc240873935" w:history="1">
+      <w:hyperlink w:anchor="_Toc240965911" w:history="1">
         <w:r>
           <w:rPr>
             <w:rStyle w:val="Hyperlink"/>
             <w:noProof/>
             <w:color w:val="auto"/>
           </w:rPr>
-          <w:t>I. THỰC TRẠNG VÀ KẾT QUẢ ĐÀO TẠO, SÁT HẠCH LÁI XE CỦA TRƯỜNG</w:t>
+          <w:t>II. CƠ SỞ XÂY DỰNG ĐỀ ÁN</w:t>
         </w:r>
         <w:r>
           <w:rPr>
@@ -742,7 +763,7 @@
             <w:webHidden/>
             <w:color w:val="auto"/>
           </w:rPr>
-          <w:instrText xml:space="preserve"> PAGEREF _Toc240873935 \h </w:instrText>
+          <w:instrText xml:space="preserve"> PAGEREF _Toc240965911 \h </w:instrText>
         </w:r>
         <w:r>
           <w:rPr>
@@ -765,7 +786,7 @@
             <w:webHidden/>
             <w:color w:val="auto"/>
           </w:rPr>
-          <w:t>5</w:t>
+          <w:t>2</w:t>
         </w:r>
         <w:r>
           <w:rPr>
@@ -779,9 +800,10 @@
     </w:p>
     <w:p>
       <w:pPr>
-        <w:pStyle w:val="TOC2"/>
+        <w:pStyle w:val="TOC1"/>
         <w:rPr>
           <w:rFonts w:asciiTheme="minorHAnsi" w:eastAsiaTheme="minorEastAsia" w:hAnsiTheme="minorHAnsi" w:cstheme="minorBidi"/>
+          <w:b w:val="0"/>
           <w:noProof/>
           <w:color w:val="auto"/>
           <w:kern w:val="2"/>
@@ -790,14 +812,40 @@
           <w14:ligatures w14:val="standardContextual"/>
         </w:rPr>
       </w:pPr>
-      <w:hyperlink w:anchor="_Toc240873936" w:history="1">
+      <w:hyperlink w:anchor="_Toc240965912" w:history="1">
         <w:r>
           <w:rPr>
             <w:rStyle w:val="Hyperlink"/>
             <w:noProof/>
             <w:color w:val="auto"/>
           </w:rPr>
-          <w:t>1. Khái quát về khoa ĐT&amp;SHLX</w:t>
+          <w:t>Phần II</w:t>
+        </w:r>
+        <w:r>
+          <w:rPr>
+            <w:noProof/>
+            <w:webHidden/>
+            <w:color w:val="auto"/>
+          </w:rPr>
+          <w:t>.</w:t>
+        </w:r>
+      </w:hyperlink>
+      <w:r>
+        <w:rPr>
+          <w:rStyle w:val="Hyperlink"/>
+          <w:noProof/>
+          <w:color w:val="auto"/>
+        </w:rPr>
+        <w:t xml:space="preserve"> </w:t>
+      </w:r>
+      <w:hyperlink w:anchor="_Toc240965913" w:history="1">
+        <w:r>
+          <w:rPr>
+            <w:rStyle w:val="Hyperlink"/>
+            <w:noProof/>
+            <w:color w:val="auto"/>
+          </w:rPr>
+          <w:t>THỰC TRẠNG CÔNG TÁC ĐÀO TẠO LÁI XE MÔ TÔ</w:t>
         </w:r>
         <w:r>
           <w:rPr>
@@ -821,7 +869,7 @@
             <w:webHidden/>
             <w:color w:val="auto"/>
           </w:rPr>
-          <w:instrText xml:space="preserve"> PAGEREF _Toc240873936 \h </w:instrText>
+          <w:instrText xml:space="preserve"> PAGEREF _Toc240965913 \h </w:instrText>
         </w:r>
         <w:r>
           <w:rPr>
@@ -858,9 +906,10 @@
     </w:p>
     <w:p>
       <w:pPr>
-        <w:pStyle w:val="TOC2"/>
+        <w:pStyle w:val="TOC1"/>
         <w:rPr>
           <w:rFonts w:asciiTheme="minorHAnsi" w:eastAsiaTheme="minorEastAsia" w:hAnsiTheme="minorHAnsi" w:cstheme="minorBidi"/>
+          <w:b w:val="0"/>
           <w:noProof/>
           <w:color w:val="auto"/>
           <w:kern w:val="2"/>
@@ -869,14 +918,14 @@
           <w14:ligatures w14:val="standardContextual"/>
         </w:rPr>
       </w:pPr>
-      <w:hyperlink w:anchor="_Toc240873937" w:history="1">
+      <w:hyperlink w:anchor="_Toc240965914" w:history="1">
         <w:r>
           <w:rPr>
             <w:rStyle w:val="Hyperlink"/>
             <w:noProof/>
             <w:color w:val="auto"/>
           </w:rPr>
-          <w:t>2. Bộ môn ĐT&amp;SHLX mô tô</w:t>
+          <w:t>VÀ CÁC ĐIỀU KIỆN BẢO ĐẢM</w:t>
         </w:r>
         <w:r>
           <w:rPr>
@@ -900,7 +949,7 @@
             <w:webHidden/>
             <w:color w:val="auto"/>
           </w:rPr>
-          <w:instrText xml:space="preserve"> PAGEREF _Toc240873937 \h </w:instrText>
+          <w:instrText xml:space="preserve"> PAGEREF _Toc240965914 \h </w:instrText>
         </w:r>
         <w:r>
           <w:rPr>
@@ -923,7 +972,7 @@
             <w:webHidden/>
             <w:color w:val="auto"/>
           </w:rPr>
-          <w:t>6</w:t>
+          <w:t>5</w:t>
         </w:r>
         <w:r>
           <w:rPr>
@@ -937,9 +986,10 @@
     </w:p>
     <w:p>
       <w:pPr>
-        <w:pStyle w:val="TOC2"/>
+        <w:pStyle w:val="TOC1"/>
         <w:rPr>
           <w:rFonts w:asciiTheme="minorHAnsi" w:eastAsiaTheme="minorEastAsia" w:hAnsiTheme="minorHAnsi" w:cstheme="minorBidi"/>
+          <w:b w:val="0"/>
           <w:noProof/>
           <w:color w:val="auto"/>
           <w:kern w:val="2"/>
@@ -948,14 +998,14 @@
           <w14:ligatures w14:val="standardContextual"/>
         </w:rPr>
       </w:pPr>
-      <w:hyperlink w:anchor="_Toc240873938" w:history="1">
+      <w:hyperlink w:anchor="_Toc240965915" w:history="1">
         <w:r>
           <w:rPr>
             <w:rStyle w:val="Hyperlink"/>
             <w:noProof/>
             <w:color w:val="auto"/>
           </w:rPr>
-          <w:t>3. Kết quả tuyển sinh, đào tạo, sát hạch lái xe</w:t>
+          <w:t>I. THỰC TRẠNG VÀ KẾT QUẢ ĐÀO TẠO, SÁT HẠCH LÁI XE CỦA TRƯỜNG</w:t>
         </w:r>
         <w:r>
           <w:rPr>
@@ -979,7 +1029,7 @@
             <w:webHidden/>
             <w:color w:val="auto"/>
           </w:rPr>
-          <w:instrText xml:space="preserve"> PAGEREF _Toc240873938 \h </w:instrText>
+          <w:instrText xml:space="preserve"> PAGEREF _Toc240965915 \h </w:instrText>
         </w:r>
         <w:r>
           <w:rPr>
@@ -1002,7 +1052,7 @@
             <w:webHidden/>
             <w:color w:val="auto"/>
           </w:rPr>
-          <w:t>7</w:t>
+          <w:t>5</w:t>
         </w:r>
         <w:r>
           <w:rPr>
@@ -1027,14 +1077,14 @@
           <w14:ligatures w14:val="standardContextual"/>
         </w:rPr>
       </w:pPr>
-      <w:hyperlink w:anchor="_Toc240873939" w:history="1">
+      <w:hyperlink w:anchor="_Toc240965916" w:history="1">
         <w:r>
           <w:rPr>
             <w:rStyle w:val="Hyperlink"/>
             <w:noProof/>
             <w:color w:val="auto"/>
           </w:rPr>
-          <w:t>4. Kết quả thu, chi hoạt động lái xe của Trường giai đoạn 2023-2025</w:t>
+          <w:t>1. Khái quát về khoa ĐT&amp;SHLX</w:t>
         </w:r>
         <w:r>
           <w:rPr>
@@ -1058,7 +1108,7 @@
             <w:webHidden/>
             <w:color w:val="auto"/>
           </w:rPr>
-          <w:instrText xml:space="preserve"> PAGEREF _Toc240873939 \h </w:instrText>
+          <w:instrText xml:space="preserve"> PAGEREF _Toc240965916 \h </w:instrText>
         </w:r>
         <w:r>
           <w:rPr>
@@ -1081,7 +1131,7 @@
             <w:webHidden/>
             <w:color w:val="auto"/>
           </w:rPr>
-          <w:t>8</w:t>
+          <w:t>5</w:t>
         </w:r>
         <w:r>
           <w:rPr>
@@ -1095,10 +1145,9 @@
     </w:p>
     <w:p>
       <w:pPr>
-        <w:pStyle w:val="TOC1"/>
+        <w:pStyle w:val="TOC2"/>
         <w:rPr>
           <w:rFonts w:asciiTheme="minorHAnsi" w:eastAsiaTheme="minorEastAsia" w:hAnsiTheme="minorHAnsi" w:cstheme="minorBidi"/>
-          <w:b w:val="0"/>
           <w:noProof/>
           <w:color w:val="auto"/>
           <w:kern w:val="2"/>
@@ -1107,14 +1156,14 @@
           <w14:ligatures w14:val="standardContextual"/>
         </w:rPr>
       </w:pPr>
-      <w:hyperlink w:anchor="_Toc240873940" w:history="1">
+      <w:hyperlink w:anchor="_Toc240965917" w:history="1">
         <w:r>
           <w:rPr>
             <w:rStyle w:val="Hyperlink"/>
             <w:noProof/>
             <w:color w:val="auto"/>
           </w:rPr>
-          <w:t>II. CƠ SỞ VẬT CHẤT, PHƯƠNG TIỆN, TRANG THIẾT BỊ HIỆN CÓ CỦA TRƯỜNG</w:t>
+          <w:t>2. Bộ môn ĐT&amp;SHLX mô tô</w:t>
         </w:r>
         <w:r>
           <w:rPr>
@@ -1138,7 +1187,7 @@
             <w:webHidden/>
             <w:color w:val="auto"/>
           </w:rPr>
-          <w:instrText xml:space="preserve"> PAGEREF _Toc240873940 \h </w:instrText>
+          <w:instrText xml:space="preserve"> PAGEREF _Toc240965917 \h </w:instrText>
         </w:r>
         <w:r>
           <w:rPr>
@@ -1161,7 +1210,7 @@
             <w:webHidden/>
             <w:color w:val="auto"/>
           </w:rPr>
-          <w:t>8</w:t>
+          <w:t>6</w:t>
         </w:r>
         <w:r>
           <w:rPr>
@@ -1186,14 +1235,14 @@
           <w14:ligatures w14:val="standardContextual"/>
         </w:rPr>
       </w:pPr>
-      <w:hyperlink w:anchor="_Toc240873941" w:history="1">
+      <w:hyperlink w:anchor="_Toc240965918" w:history="1">
         <w:r>
           <w:rPr>
             <w:rStyle w:val="Hyperlink"/>
             <w:noProof/>
             <w:color w:val="auto"/>
           </w:rPr>
-          <w:t>1. Về sân tập, sân sát hạch</w:t>
+          <w:t>3. Kết quả tuyển sinh, đào tạo, sát hạch lái xe</w:t>
         </w:r>
         <w:r>
           <w:rPr>
@@ -1217,7 +1266,7 @@
             <w:webHidden/>
             <w:color w:val="auto"/>
           </w:rPr>
-          <w:instrText xml:space="preserve"> PAGEREF _Toc240873941 \h </w:instrText>
+          <w:instrText xml:space="preserve"> PAGEREF _Toc240965918 \h </w:instrText>
         </w:r>
         <w:r>
           <w:rPr>
@@ -1240,7 +1289,7 @@
             <w:webHidden/>
             <w:color w:val="auto"/>
           </w:rPr>
-          <w:t>8</w:t>
+          <w:t>7</w:t>
         </w:r>
         <w:r>
           <w:rPr>
@@ -1265,14 +1314,14 @@
           <w14:ligatures w14:val="standardContextual"/>
         </w:rPr>
       </w:pPr>
-      <w:hyperlink w:anchor="_Toc240873942" w:history="1">
+      <w:hyperlink w:anchor="_Toc240965919" w:history="1">
         <w:r>
           <w:rPr>
             <w:rStyle w:val="Hyperlink"/>
             <w:noProof/>
             <w:color w:val="auto"/>
           </w:rPr>
-          <w:t>2. Về phương tiện</w:t>
+          <w:t>4. Kết quả thu, chi hoạt động lái xe của Trường giai đoạn 2023-2025</w:t>
         </w:r>
         <w:r>
           <w:rPr>
@@ -1296,7 +1345,7 @@
             <w:webHidden/>
             <w:color w:val="auto"/>
           </w:rPr>
-          <w:instrText xml:space="preserve"> PAGEREF _Toc240873942 \h </w:instrText>
+          <w:instrText xml:space="preserve"> PAGEREF _Toc240965919 \h </w:instrText>
         </w:r>
         <w:r>
           <w:rPr>
@@ -1319,7 +1368,7 @@
             <w:webHidden/>
             <w:color w:val="auto"/>
           </w:rPr>
-          <w:t>9</w:t>
+          <w:t>8</w:t>
         </w:r>
         <w:r>
           <w:rPr>
@@ -1333,9 +1382,10 @@
     </w:p>
     <w:p>
       <w:pPr>
-        <w:pStyle w:val="TOC2"/>
+        <w:pStyle w:val="TOC1"/>
         <w:rPr>
           <w:rFonts w:asciiTheme="minorHAnsi" w:eastAsiaTheme="minorEastAsia" w:hAnsiTheme="minorHAnsi" w:cstheme="minorBidi"/>
+          <w:b w:val="0"/>
           <w:noProof/>
           <w:color w:val="auto"/>
           <w:kern w:val="2"/>
@@ -1344,14 +1394,14 @@
           <w14:ligatures w14:val="standardContextual"/>
         </w:rPr>
       </w:pPr>
-      <w:hyperlink w:anchor="_Toc240873943" w:history="1">
+      <w:hyperlink w:anchor="_Toc240965920" w:history="1">
         <w:r>
           <w:rPr>
             <w:rStyle w:val="Hyperlink"/>
             <w:noProof/>
             <w:color w:val="auto"/>
           </w:rPr>
-          <w:t>3. Về phòng học, trang thiết bị giảng dạy lý thuyết</w:t>
+          <w:t>II. CƠ SỞ VẬT CHẤT, PHƯƠNG TIỆN, TRANG THIẾT BỊ HIỆN CÓ CỦA TRƯỜNG</w:t>
         </w:r>
         <w:r>
           <w:rPr>
@@ -1375,7 +1425,7 @@
             <w:webHidden/>
             <w:color w:val="auto"/>
           </w:rPr>
-          <w:instrText xml:space="preserve"> PAGEREF _Toc240873943 \h </w:instrText>
+          <w:instrText xml:space="preserve"> PAGEREF _Toc240965920 \h </w:instrText>
         </w:r>
         <w:r>
           <w:rPr>
@@ -1398,7 +1448,7 @@
             <w:webHidden/>
             <w:color w:val="auto"/>
           </w:rPr>
-          <w:t>10</w:t>
+          <w:t>8</w:t>
         </w:r>
         <w:r>
           <w:rPr>
@@ -1412,10 +1462,9 @@
     </w:p>
     <w:p>
       <w:pPr>
-        <w:pStyle w:val="TOC1"/>
+        <w:pStyle w:val="TOC2"/>
         <w:rPr>
           <w:rFonts w:asciiTheme="minorHAnsi" w:eastAsiaTheme="minorEastAsia" w:hAnsiTheme="minorHAnsi" w:cstheme="minorBidi"/>
-          <w:b w:val="0"/>
           <w:noProof/>
           <w:color w:val="auto"/>
           <w:kern w:val="2"/>
@@ -1424,14 +1473,14 @@
           <w14:ligatures w14:val="standardContextual"/>
         </w:rPr>
       </w:pPr>
-      <w:hyperlink w:anchor="_Toc240873944" w:history="1">
+      <w:hyperlink w:anchor="_Toc240965921" w:history="1">
         <w:r>
           <w:rPr>
             <w:rStyle w:val="Hyperlink"/>
             <w:noProof/>
             <w:color w:val="auto"/>
           </w:rPr>
-          <w:t>III. THỰC TRẠNG NHU CẦU ĐÀO TẠO VÀ SÁT HẠCH LÁI XE MÔ TÔ HẠNG A</w:t>
+          <w:t>1. Về sân tập, sân sát hạch</w:t>
         </w:r>
         <w:r>
           <w:rPr>
@@ -1455,7 +1504,7 @@
             <w:webHidden/>
             <w:color w:val="auto"/>
           </w:rPr>
-          <w:instrText xml:space="preserve"> PAGEREF _Toc240873944 \h </w:instrText>
+          <w:instrText xml:space="preserve"> PAGEREF _Toc240965921 \h </w:instrText>
         </w:r>
         <w:r>
           <w:rPr>
@@ -1478,7 +1527,7 @@
             <w:webHidden/>
             <w:color w:val="auto"/>
           </w:rPr>
-          <w:t>11</w:t>
+          <w:t>8</w:t>
         </w:r>
         <w:r>
           <w:rPr>
@@ -1492,10 +1541,9 @@
     </w:p>
     <w:p>
       <w:pPr>
-        <w:pStyle w:val="TOC1"/>
+        <w:pStyle w:val="TOC2"/>
         <w:rPr>
           <w:rFonts w:asciiTheme="minorHAnsi" w:eastAsiaTheme="minorEastAsia" w:hAnsiTheme="minorHAnsi" w:cstheme="minorBidi"/>
-          <w:b w:val="0"/>
           <w:noProof/>
           <w:color w:val="auto"/>
           <w:kern w:val="2"/>
@@ -1504,14 +1552,14 @@
           <w14:ligatures w14:val="standardContextual"/>
         </w:rPr>
       </w:pPr>
-      <w:hyperlink w:anchor="_Toc240873945" w:history="1">
+      <w:hyperlink w:anchor="_Toc240965922" w:history="1">
         <w:r>
           <w:rPr>
             <w:rStyle w:val="Hyperlink"/>
             <w:noProof/>
             <w:color w:val="auto"/>
           </w:rPr>
-          <w:t>IV. ĐÁNH GIÁ CHUNG</w:t>
+          <w:t>2. Về phương tiện</w:t>
         </w:r>
         <w:r>
           <w:rPr>
@@ -1535,7 +1583,7 @@
             <w:webHidden/>
             <w:color w:val="auto"/>
           </w:rPr>
-          <w:instrText xml:space="preserve"> PAGEREF _Toc240873945 \h </w:instrText>
+          <w:instrText xml:space="preserve"> PAGEREF _Toc240965922 \h </w:instrText>
         </w:r>
         <w:r>
           <w:rPr>
@@ -1558,7 +1606,7 @@
             <w:webHidden/>
             <w:color w:val="auto"/>
           </w:rPr>
-          <w:t>11</w:t>
+          <w:t>9</w:t>
         </w:r>
         <w:r>
           <w:rPr>
@@ -1583,14 +1631,14 @@
           <w14:ligatures w14:val="standardContextual"/>
         </w:rPr>
       </w:pPr>
-      <w:hyperlink w:anchor="_Toc240873946" w:history="1">
+      <w:hyperlink w:anchor="_Toc240965923" w:history="1">
         <w:r>
           <w:rPr>
             <w:rStyle w:val="Hyperlink"/>
             <w:noProof/>
             <w:color w:val="auto"/>
           </w:rPr>
-          <w:t>1. Ưu điểm, kết quả và những thuận lợi</w:t>
+          <w:t>3. Về phòng học, trang thiết bị giảng dạy lý thuyết</w:t>
         </w:r>
         <w:r>
           <w:rPr>
@@ -1614,7 +1662,7 @@
             <w:webHidden/>
             <w:color w:val="auto"/>
           </w:rPr>
-          <w:instrText xml:space="preserve"> PAGEREF _Toc240873946 \h </w:instrText>
+          <w:instrText xml:space="preserve"> PAGEREF _Toc240965923 \h </w:instrText>
         </w:r>
         <w:r>
           <w:rPr>
@@ -1637,7 +1685,7 @@
             <w:webHidden/>
             <w:color w:val="auto"/>
           </w:rPr>
-          <w:t>11</w:t>
+          <w:t>10</w:t>
         </w:r>
         <w:r>
           <w:rPr>
@@ -1651,9 +1699,10 @@
     </w:p>
     <w:p>
       <w:pPr>
-        <w:pStyle w:val="TOC2"/>
+        <w:pStyle w:val="TOC1"/>
         <w:rPr>
           <w:rFonts w:asciiTheme="minorHAnsi" w:eastAsiaTheme="minorEastAsia" w:hAnsiTheme="minorHAnsi" w:cstheme="minorBidi"/>
+          <w:b w:val="0"/>
           <w:noProof/>
           <w:color w:val="auto"/>
           <w:kern w:val="2"/>
@@ -1662,14 +1711,14 @@
           <w14:ligatures w14:val="standardContextual"/>
         </w:rPr>
       </w:pPr>
-      <w:hyperlink w:anchor="_Toc240873947" w:history="1">
+      <w:hyperlink w:anchor="_Toc240965924" w:history="1">
         <w:r>
           <w:rPr>
             <w:rStyle w:val="Hyperlink"/>
             <w:noProof/>
             <w:color w:val="auto"/>
           </w:rPr>
-          <w:t>2. Những hạn chế, khó khăn và nguyên nhân</w:t>
+          <w:t>III. THỰC TRẠNG NHU CẦU ĐÀO TẠO VÀ SÁT HẠCH LÁI XE MÔ TÔ HẠNG A</w:t>
         </w:r>
         <w:r>
           <w:rPr>
@@ -1693,7 +1742,7 @@
             <w:webHidden/>
             <w:color w:val="auto"/>
           </w:rPr>
-          <w:instrText xml:space="preserve"> PAGEREF _Toc240873947 \h </w:instrText>
+          <w:instrText xml:space="preserve"> PAGEREF _Toc240965924 \h </w:instrText>
         </w:r>
         <w:r>
           <w:rPr>
@@ -1716,7 +1765,7 @@
             <w:webHidden/>
             <w:color w:val="auto"/>
           </w:rPr>
-          <w:t>12</w:t>
+          <w:t>11</w:t>
         </w:r>
         <w:r>
           <w:rPr>
@@ -1742,14 +1791,14 @@
           <w14:ligatures w14:val="standardContextual"/>
         </w:rPr>
       </w:pPr>
-      <w:hyperlink w:anchor="_Toc240873948" w:history="1">
+      <w:hyperlink w:anchor="_Toc240965925" w:history="1">
         <w:r>
           <w:rPr>
             <w:rStyle w:val="Hyperlink"/>
             <w:noProof/>
             <w:color w:val="auto"/>
           </w:rPr>
-          <w:t>I. MỤC TIÊU, QUAN ĐIỂM</w:t>
+          <w:t>IV. ĐÁNH GIÁ CHUNG</w:t>
         </w:r>
         <w:r>
           <w:rPr>
@@ -1773,7 +1822,7 @@
             <w:webHidden/>
             <w:color w:val="auto"/>
           </w:rPr>
-          <w:instrText xml:space="preserve"> PAGEREF _Toc240873948 \h </w:instrText>
+          <w:instrText xml:space="preserve"> PAGEREF _Toc240965925 \h </w:instrText>
         </w:r>
         <w:r>
           <w:rPr>
@@ -1796,7 +1845,7 @@
             <w:webHidden/>
             <w:color w:val="auto"/>
           </w:rPr>
-          <w:t>13</w:t>
+          <w:t>11</w:t>
         </w:r>
         <w:r>
           <w:rPr>
@@ -1821,14 +1870,14 @@
           <w14:ligatures w14:val="standardContextual"/>
         </w:rPr>
       </w:pPr>
-      <w:hyperlink w:anchor="_Toc240873949" w:history="1">
+      <w:hyperlink w:anchor="_Toc240965926" w:history="1">
         <w:r>
           <w:rPr>
             <w:rStyle w:val="Hyperlink"/>
             <w:noProof/>
             <w:color w:val="auto"/>
           </w:rPr>
-          <w:t>1. Mục tiêu chung</w:t>
+          <w:t>1. Ưu điểm, kết quả và những thuận lợi</w:t>
         </w:r>
         <w:r>
           <w:rPr>
@@ -1852,7 +1901,7 @@
             <w:webHidden/>
             <w:color w:val="auto"/>
           </w:rPr>
-          <w:instrText xml:space="preserve"> PAGEREF _Toc240873949 \h </w:instrText>
+          <w:instrText xml:space="preserve"> PAGEREF _Toc240965926 \h </w:instrText>
         </w:r>
         <w:r>
           <w:rPr>
@@ -1875,7 +1924,7 @@
             <w:webHidden/>
             <w:color w:val="auto"/>
           </w:rPr>
-          <w:t>13</w:t>
+          <w:t>11</w:t>
         </w:r>
         <w:r>
           <w:rPr>
@@ -1900,14 +1949,14 @@
           <w14:ligatures w14:val="standardContextual"/>
         </w:rPr>
       </w:pPr>
-      <w:hyperlink w:anchor="_Toc240873950" w:history="1">
+      <w:hyperlink w:anchor="_Toc240965927" w:history="1">
         <w:r>
           <w:rPr>
             <w:rStyle w:val="Hyperlink"/>
             <w:noProof/>
             <w:color w:val="auto"/>
           </w:rPr>
-          <w:t>2. Mục tiêu cụ thể</w:t>
+          <w:t>2. Những hạn chế, khó khăn và nguyên nhân</w:t>
         </w:r>
         <w:r>
           <w:rPr>
@@ -1931,7 +1980,7 @@
             <w:webHidden/>
             <w:color w:val="auto"/>
           </w:rPr>
-          <w:instrText xml:space="preserve"> PAGEREF _Toc240873950 \h </w:instrText>
+          <w:instrText xml:space="preserve"> PAGEREF _Toc240965927 \h </w:instrText>
         </w:r>
         <w:r>
           <w:rPr>
@@ -1954,7 +2003,7 @@
             <w:webHidden/>
             <w:color w:val="auto"/>
           </w:rPr>
-          <w:t>13</w:t>
+          <w:t>12</w:t>
         </w:r>
         <w:r>
           <w:rPr>
@@ -1968,9 +2017,10 @@
     </w:p>
     <w:p>
       <w:pPr>
-        <w:pStyle w:val="TOC2"/>
+        <w:pStyle w:val="TOC1"/>
         <w:rPr>
           <w:rFonts w:asciiTheme="minorHAnsi" w:eastAsiaTheme="minorEastAsia" w:hAnsiTheme="minorHAnsi" w:cstheme="minorBidi"/>
+          <w:b w:val="0"/>
           <w:noProof/>
           <w:color w:val="auto"/>
           <w:kern w:val="2"/>
@@ -1979,14 +2029,40 @@
           <w14:ligatures w14:val="standardContextual"/>
         </w:rPr>
       </w:pPr>
-      <w:hyperlink w:anchor="_Toc240873951" w:history="1">
+      <w:hyperlink w:anchor="_Toc240965928" w:history="1">
         <w:r>
           <w:rPr>
             <w:rStyle w:val="Hyperlink"/>
             <w:noProof/>
             <w:color w:val="auto"/>
           </w:rPr>
-          <w:t>3. Quan điểm xây dựng Đề án</w:t>
+          <w:t>Phần III</w:t>
+        </w:r>
+        <w:r>
+          <w:rPr>
+            <w:noProof/>
+            <w:webHidden/>
+            <w:color w:val="auto"/>
+          </w:rPr>
+          <w:t>.</w:t>
+        </w:r>
+      </w:hyperlink>
+      <w:r>
+        <w:rPr>
+          <w:rStyle w:val="Hyperlink"/>
+          <w:noProof/>
+          <w:color w:val="auto"/>
+        </w:rPr>
+        <w:t xml:space="preserve"> </w:t>
+      </w:r>
+      <w:hyperlink w:anchor="_Toc240965929" w:history="1">
+        <w:r>
+          <w:rPr>
+            <w:rStyle w:val="Hyperlink"/>
+            <w:noProof/>
+            <w:color w:val="auto"/>
+          </w:rPr>
+          <w:t>NỘI DUNG, GIẢI PHÁP CỦA ĐỀ ÁN</w:t>
         </w:r>
         <w:r>
           <w:rPr>
@@ -2010,7 +2086,7 @@
             <w:webHidden/>
             <w:color w:val="auto"/>
           </w:rPr>
-          <w:instrText xml:space="preserve"> PAGEREF _Toc240873951 \h </w:instrText>
+          <w:instrText xml:space="preserve"> PAGEREF _Toc240965929 \h </w:instrText>
         </w:r>
         <w:r>
           <w:rPr>
@@ -2047,9 +2123,10 @@
     </w:p>
     <w:p>
       <w:pPr>
-        <w:pStyle w:val="TOC2"/>
+        <w:pStyle w:val="TOC1"/>
         <w:rPr>
           <w:rFonts w:asciiTheme="minorHAnsi" w:eastAsiaTheme="minorEastAsia" w:hAnsiTheme="minorHAnsi" w:cstheme="minorBidi"/>
+          <w:b w:val="0"/>
           <w:noProof/>
           <w:color w:val="auto"/>
           <w:kern w:val="2"/>
@@ -2058,14 +2135,14 @@
           <w14:ligatures w14:val="standardContextual"/>
         </w:rPr>
       </w:pPr>
-      <w:hyperlink w:anchor="_Toc240873952" w:history="1">
+      <w:hyperlink w:anchor="_Toc240965930" w:history="1">
         <w:r>
           <w:rPr>
             <w:rStyle w:val="Hyperlink"/>
             <w:noProof/>
             <w:color w:val="auto"/>
           </w:rPr>
-          <w:t>4. Mục tiêu tuyển sinh, quy mô đào tạo dự kiến theo năm (từ 2027)</w:t>
+          <w:t>I. MỤC TIÊU, QUAN ĐIỂM</w:t>
         </w:r>
         <w:r>
           <w:rPr>
@@ -2089,7 +2166,7 @@
             <w:webHidden/>
             <w:color w:val="auto"/>
           </w:rPr>
-          <w:instrText xml:space="preserve"> PAGEREF _Toc240873952 \h </w:instrText>
+          <w:instrText xml:space="preserve"> PAGEREF _Toc240965930 \h </w:instrText>
         </w:r>
         <w:r>
           <w:rPr>
@@ -2112,7 +2189,7 @@
             <w:webHidden/>
             <w:color w:val="auto"/>
           </w:rPr>
-          <w:t>14</w:t>
+          <w:t>13</w:t>
         </w:r>
         <w:r>
           <w:rPr>
@@ -2126,10 +2203,9 @@
     </w:p>
     <w:p>
       <w:pPr>
-        <w:pStyle w:val="TOC1"/>
+        <w:pStyle w:val="TOC2"/>
         <w:rPr>
           <w:rFonts w:asciiTheme="minorHAnsi" w:eastAsiaTheme="minorEastAsia" w:hAnsiTheme="minorHAnsi" w:cstheme="minorBidi"/>
-          <w:b w:val="0"/>
           <w:noProof/>
           <w:color w:val="auto"/>
           <w:kern w:val="2"/>
@@ -2138,14 +2214,14 @@
           <w14:ligatures w14:val="standardContextual"/>
         </w:rPr>
       </w:pPr>
-      <w:hyperlink w:anchor="_Toc240873953" w:history="1">
+      <w:hyperlink w:anchor="_Toc240965931" w:history="1">
         <w:r>
           <w:rPr>
             <w:rStyle w:val="Hyperlink"/>
             <w:noProof/>
             <w:color w:val="auto"/>
           </w:rPr>
-          <w:t>II. HOÀN THIỆN CHỨC NĂNG, NHIỆM VỤ, TỔ CHỨC NHÂN SỰ</w:t>
+          <w:t>1. Mục tiêu chung</w:t>
         </w:r>
         <w:r>
           <w:rPr>
@@ -2169,7 +2245,7 @@
             <w:webHidden/>
             <w:color w:val="auto"/>
           </w:rPr>
-          <w:instrText xml:space="preserve"> PAGEREF _Toc240873953 \h </w:instrText>
+          <w:instrText xml:space="preserve"> PAGEREF _Toc240965931 \h </w:instrText>
         </w:r>
         <w:r>
           <w:rPr>
@@ -2192,7 +2268,7 @@
             <w:webHidden/>
             <w:color w:val="auto"/>
           </w:rPr>
-          <w:t>14</w:t>
+          <w:t>13</w:t>
         </w:r>
         <w:r>
           <w:rPr>
@@ -2217,14 +2293,14 @@
           <w14:ligatures w14:val="standardContextual"/>
         </w:rPr>
       </w:pPr>
-      <w:hyperlink w:anchor="_Toc240873954" w:history="1">
+      <w:hyperlink w:anchor="_Toc240965932" w:history="1">
         <w:r>
           <w:rPr>
             <w:rStyle w:val="Hyperlink"/>
             <w:noProof/>
             <w:color w:val="auto"/>
           </w:rPr>
-          <w:t>1. Đơn vị/bộ môn chủ trì thực hiện</w:t>
+          <w:t>2. Mục tiêu cụ thể</w:t>
         </w:r>
         <w:r>
           <w:rPr>
@@ -2248,7 +2324,7 @@
             <w:webHidden/>
             <w:color w:val="auto"/>
           </w:rPr>
-          <w:instrText xml:space="preserve"> PAGEREF _Toc240873954 \h </w:instrText>
+          <w:instrText xml:space="preserve"> PAGEREF _Toc240965932 \h </w:instrText>
         </w:r>
         <w:r>
           <w:rPr>
@@ -2271,7 +2347,7 @@
             <w:webHidden/>
             <w:color w:val="auto"/>
           </w:rPr>
-          <w:t>14</w:t>
+          <w:t>13</w:t>
         </w:r>
         <w:r>
           <w:rPr>
@@ -2296,14 +2372,14 @@
           <w14:ligatures w14:val="standardContextual"/>
         </w:rPr>
       </w:pPr>
-      <w:hyperlink w:anchor="_Toc240873955" w:history="1">
+      <w:hyperlink w:anchor="_Toc240965933" w:history="1">
         <w:r>
           <w:rPr>
             <w:rStyle w:val="Hyperlink"/>
             <w:noProof/>
             <w:color w:val="auto"/>
           </w:rPr>
-          <w:t>2. Về nhân sự</w:t>
+          <w:t>3. Quan điểm xây dựng Đề án</w:t>
         </w:r>
         <w:r>
           <w:rPr>
@@ -2327,7 +2403,7 @@
             <w:webHidden/>
             <w:color w:val="auto"/>
           </w:rPr>
-          <w:instrText xml:space="preserve"> PAGEREF _Toc240873955 \h </w:instrText>
+          <w:instrText xml:space="preserve"> PAGEREF _Toc240965933 \h </w:instrText>
         </w:r>
         <w:r>
           <w:rPr>
@@ -2350,7 +2426,7 @@
             <w:webHidden/>
             <w:color w:val="auto"/>
           </w:rPr>
-          <w:t>14</w:t>
+          <w:t>13</w:t>
         </w:r>
         <w:r>
           <w:rPr>
@@ -2364,10 +2440,9 @@
     </w:p>
     <w:p>
       <w:pPr>
-        <w:pStyle w:val="TOC1"/>
+        <w:pStyle w:val="TOC2"/>
         <w:rPr>
           <w:rFonts w:asciiTheme="minorHAnsi" w:eastAsiaTheme="minorEastAsia" w:hAnsiTheme="minorHAnsi" w:cstheme="minorBidi"/>
-          <w:b w:val="0"/>
           <w:noProof/>
           <w:color w:val="auto"/>
           <w:kern w:val="2"/>
@@ -2376,14 +2451,14 @@
           <w14:ligatures w14:val="standardContextual"/>
         </w:rPr>
       </w:pPr>
-      <w:hyperlink w:anchor="_Toc240873956" w:history="1">
+      <w:hyperlink w:anchor="_Toc240965934" w:history="1">
         <w:r>
           <w:rPr>
             <w:rStyle w:val="Hyperlink"/>
             <w:noProof/>
             <w:color w:val="auto"/>
           </w:rPr>
-          <w:t>III. ĐỊA ĐIỂM ĐẦU TƯ</w:t>
+          <w:t>4. Mục tiêu tuyển sinh, quy mô đào tạo dự kiến theo năm (từ 2027)</w:t>
         </w:r>
         <w:r>
           <w:rPr>
@@ -2407,7 +2482,7 @@
             <w:webHidden/>
             <w:color w:val="auto"/>
           </w:rPr>
-          <w:instrText xml:space="preserve"> PAGEREF _Toc240873956 \h </w:instrText>
+          <w:instrText xml:space="preserve"> PAGEREF _Toc240965934 \h </w:instrText>
         </w:r>
         <w:r>
           <w:rPr>
@@ -2456,14 +2531,14 @@
           <w14:ligatures w14:val="standardContextual"/>
         </w:rPr>
       </w:pPr>
-      <w:hyperlink w:anchor="_Toc240873957" w:history="1">
+      <w:hyperlink w:anchor="_Toc240965935" w:history="1">
         <w:r>
           <w:rPr>
             <w:rStyle w:val="Hyperlink"/>
             <w:noProof/>
             <w:color w:val="auto"/>
           </w:rPr>
-          <w:t>IV. NHU CẦU ĐẦU TƯ CƠ SỞ VẬT CHẤT, PHƯƠNG TIỆN, THIẾT BỊ</w:t>
+          <w:t>II. HOÀN THIỆN CHỨC NĂNG, NHIỆM VỤ, TỔ CHỨC NHÂN SỰ</w:t>
         </w:r>
         <w:r>
           <w:rPr>
@@ -2487,7 +2562,7 @@
             <w:webHidden/>
             <w:color w:val="auto"/>
           </w:rPr>
-          <w:instrText xml:space="preserve"> PAGEREF _Toc240873957 \h </w:instrText>
+          <w:instrText xml:space="preserve"> PAGEREF _Toc240965935 \h </w:instrText>
         </w:r>
         <w:r>
           <w:rPr>
@@ -2510,7 +2585,7 @@
             <w:webHidden/>
             <w:color w:val="auto"/>
           </w:rPr>
-          <w:t>15</w:t>
+          <w:t>14</w:t>
         </w:r>
         <w:r>
           <w:rPr>
@@ -2535,14 +2610,14 @@
           <w14:ligatures w14:val="standardContextual"/>
         </w:rPr>
       </w:pPr>
-      <w:hyperlink w:anchor="_Toc240873958" w:history="1">
+      <w:hyperlink w:anchor="_Toc240965936" w:history="1">
         <w:r>
           <w:rPr>
             <w:rStyle w:val="Hyperlink"/>
             <w:noProof/>
             <w:color w:val="auto"/>
           </w:rPr>
-          <w:t>1. Sân tập, sân sát hạch</w:t>
+          <w:t>1. Đơn vị/bộ môn chủ trì thực hiện</w:t>
         </w:r>
         <w:r>
           <w:rPr>
@@ -2566,7 +2641,7 @@
             <w:webHidden/>
             <w:color w:val="auto"/>
           </w:rPr>
-          <w:instrText xml:space="preserve"> PAGEREF _Toc240873958 \h </w:instrText>
+          <w:instrText xml:space="preserve"> PAGEREF _Toc240965936 \h </w:instrText>
         </w:r>
         <w:r>
           <w:rPr>
@@ -2589,7 +2664,7 @@
             <w:webHidden/>
             <w:color w:val="auto"/>
           </w:rPr>
-          <w:t>15</w:t>
+          <w:t>14</w:t>
         </w:r>
         <w:r>
           <w:rPr>
@@ -2614,14 +2689,14 @@
           <w14:ligatures w14:val="standardContextual"/>
         </w:rPr>
       </w:pPr>
-      <w:hyperlink w:anchor="_Toc240873959" w:history="1">
+      <w:hyperlink w:anchor="_Toc240965937" w:history="1">
         <w:r>
           <w:rPr>
             <w:rStyle w:val="Hyperlink"/>
             <w:noProof/>
             <w:color w:val="auto"/>
           </w:rPr>
-          <w:t>2. Về phương tiện, thiết bị:</w:t>
+          <w:t>2. Về nhân sự</w:t>
         </w:r>
         <w:r>
           <w:rPr>
@@ -2645,7 +2720,7 @@
             <w:webHidden/>
             <w:color w:val="auto"/>
           </w:rPr>
-          <w:instrText xml:space="preserve"> PAGEREF _Toc240873959 \h </w:instrText>
+          <w:instrText xml:space="preserve"> PAGEREF _Toc240965937 \h </w:instrText>
         </w:r>
         <w:r>
           <w:rPr>
@@ -2668,7 +2743,7 @@
             <w:webHidden/>
             <w:color w:val="auto"/>
           </w:rPr>
-          <w:t>16</w:t>
+          <w:t>14</w:t>
         </w:r>
         <w:r>
           <w:rPr>
@@ -2694,14 +2769,14 @@
           <w14:ligatures w14:val="standardContextual"/>
         </w:rPr>
       </w:pPr>
-      <w:hyperlink w:anchor="_Toc240873960" w:history="1">
+      <w:hyperlink w:anchor="_Toc240965938" w:history="1">
         <w:r>
           <w:rPr>
             <w:rStyle w:val="Hyperlink"/>
             <w:noProof/>
             <w:color w:val="auto"/>
           </w:rPr>
-          <w:t>V. CƠ CHẾ HOẠT ĐỘNG, QUẢN LÝ TÀI CHÍNH</w:t>
+          <w:t>III. ĐỊA ĐIỂM ĐẦU TƯ</w:t>
         </w:r>
         <w:r>
           <w:rPr>
@@ -2725,7 +2800,7 @@
             <w:webHidden/>
             <w:color w:val="auto"/>
           </w:rPr>
-          <w:instrText xml:space="preserve"> PAGEREF _Toc240873960 \h </w:instrText>
+          <w:instrText xml:space="preserve"> PAGEREF _Toc240965938 \h </w:instrText>
         </w:r>
         <w:r>
           <w:rPr>
@@ -2748,7 +2823,7 @@
             <w:webHidden/>
             <w:color w:val="auto"/>
           </w:rPr>
-          <w:t>17</w:t>
+          <w:t>14</w:t>
         </w:r>
         <w:r>
           <w:rPr>
@@ -2774,14 +2849,14 @@
           <w14:ligatures w14:val="standardContextual"/>
         </w:rPr>
       </w:pPr>
-      <w:hyperlink w:anchor="_Toc240873961" w:history="1">
+      <w:hyperlink w:anchor="_Toc240965939" w:history="1">
         <w:r>
           <w:rPr>
             <w:rStyle w:val="Hyperlink"/>
             <w:noProof/>
             <w:color w:val="auto"/>
           </w:rPr>
-          <w:t>I. LỘ TRÌNH, CÁC BƯỚC THỰC HIỆN</w:t>
+          <w:t>IV. NHU CẦU ĐẦU TƯ CƠ SỞ VẬT CHẤT, PHƯƠNG TIỆN, THIẾT BỊ</w:t>
         </w:r>
         <w:r>
           <w:rPr>
@@ -2805,7 +2880,7 @@
             <w:webHidden/>
             <w:color w:val="auto"/>
           </w:rPr>
-          <w:instrText xml:space="preserve"> PAGEREF _Toc240873961 \h </w:instrText>
+          <w:instrText xml:space="preserve"> PAGEREF _Toc240965939 \h </w:instrText>
         </w:r>
         <w:r>
           <w:rPr>
@@ -2828,7 +2903,7 @@
             <w:webHidden/>
             <w:color w:val="auto"/>
           </w:rPr>
-          <w:t>19</w:t>
+          <w:t>15</w:t>
         </w:r>
         <w:r>
           <w:rPr>
@@ -2842,10 +2917,9 @@
     </w:p>
     <w:p>
       <w:pPr>
-        <w:pStyle w:val="TOC1"/>
+        <w:pStyle w:val="TOC2"/>
         <w:rPr>
           <w:rFonts w:asciiTheme="minorHAnsi" w:eastAsiaTheme="minorEastAsia" w:hAnsiTheme="minorHAnsi" w:cstheme="minorBidi"/>
-          <w:b w:val="0"/>
           <w:noProof/>
           <w:color w:val="auto"/>
           <w:kern w:val="2"/>
@@ -2854,14 +2928,14 @@
           <w14:ligatures w14:val="standardContextual"/>
         </w:rPr>
       </w:pPr>
-      <w:hyperlink w:anchor="_Toc240873962" w:history="1">
+      <w:hyperlink w:anchor="_Toc240965940" w:history="1">
         <w:r>
           <w:rPr>
             <w:rStyle w:val="Hyperlink"/>
             <w:noProof/>
             <w:color w:val="auto"/>
           </w:rPr>
-          <w:t>II. NHU CẦU KINH PHÍ</w:t>
+          <w:t>1. Sân tập, sân sát hạch</w:t>
         </w:r>
         <w:r>
           <w:rPr>
@@ -2885,7 +2959,7 @@
             <w:webHidden/>
             <w:color w:val="auto"/>
           </w:rPr>
-          <w:instrText xml:space="preserve"> PAGEREF _Toc240873962 \h </w:instrText>
+          <w:instrText xml:space="preserve"> PAGEREF _Toc240965940 \h </w:instrText>
         </w:r>
         <w:r>
           <w:rPr>
@@ -2908,7 +2982,7 @@
             <w:webHidden/>
             <w:color w:val="auto"/>
           </w:rPr>
-          <w:t>19</w:t>
+          <w:t>15</w:t>
         </w:r>
         <w:r>
           <w:rPr>
@@ -2922,10 +2996,9 @@
     </w:p>
     <w:p>
       <w:pPr>
-        <w:pStyle w:val="TOC1"/>
+        <w:pStyle w:val="TOC2"/>
         <w:rPr>
           <w:rFonts w:asciiTheme="minorHAnsi" w:eastAsiaTheme="minorEastAsia" w:hAnsiTheme="minorHAnsi" w:cstheme="minorBidi"/>
-          <w:b w:val="0"/>
           <w:noProof/>
           <w:color w:val="auto"/>
           <w:kern w:val="2"/>
@@ -2934,14 +3007,14 @@
           <w14:ligatures w14:val="standardContextual"/>
         </w:rPr>
       </w:pPr>
-      <w:hyperlink w:anchor="_Toc240873963" w:history="1">
+      <w:hyperlink w:anchor="_Toc240965941" w:history="1">
         <w:r>
           <w:rPr>
             <w:rStyle w:val="Hyperlink"/>
             <w:noProof/>
             <w:color w:val="auto"/>
           </w:rPr>
-          <w:t>I. HIỆU QUẢ KINH TẾ</w:t>
+          <w:t>2. Về phương tiện, thiết bị:</w:t>
         </w:r>
         <w:r>
           <w:rPr>
@@ -2965,7 +3038,7 @@
             <w:webHidden/>
             <w:color w:val="auto"/>
           </w:rPr>
-          <w:instrText xml:space="preserve"> PAGEREF _Toc240873963 \h </w:instrText>
+          <w:instrText xml:space="preserve"> PAGEREF _Toc240965941 \h </w:instrText>
         </w:r>
         <w:r>
           <w:rPr>
@@ -2988,7 +3061,7 @@
             <w:webHidden/>
             <w:color w:val="auto"/>
           </w:rPr>
-          <w:t>21</w:t>
+          <w:t>16</w:t>
         </w:r>
         <w:r>
           <w:rPr>
@@ -3014,14 +3087,14 @@
           <w14:ligatures w14:val="standardContextual"/>
         </w:rPr>
       </w:pPr>
-      <w:hyperlink w:anchor="_Toc240873964" w:history="1">
+      <w:hyperlink w:anchor="_Toc240965942" w:history="1">
         <w:r>
           <w:rPr>
             <w:rStyle w:val="Hyperlink"/>
             <w:noProof/>
             <w:color w:val="auto"/>
           </w:rPr>
-          <w:t>II. HIỆU QUẢ XÃ HỘI, MÔI TRƯỜNG, TÍNH BỀN VỮNG</w:t>
+          <w:t>V. CƠ CHẾ HOẠT ĐỘNG, QUẢN LÝ TÀI CHÍNH</w:t>
         </w:r>
         <w:r>
           <w:rPr>
@@ -3045,7 +3118,7 @@
             <w:webHidden/>
             <w:color w:val="auto"/>
           </w:rPr>
-          <w:instrText xml:space="preserve"> PAGEREF _Toc240873964 \h </w:instrText>
+          <w:instrText xml:space="preserve"> PAGEREF _Toc240965942 \h </w:instrText>
         </w:r>
         <w:r>
           <w:rPr>
@@ -3068,7 +3141,7 @@
             <w:webHidden/>
             <w:color w:val="auto"/>
           </w:rPr>
-          <w:t>21</w:t>
+          <w:t>17</w:t>
         </w:r>
         <w:r>
           <w:rPr>
@@ -3094,14 +3167,40 @@
           <w14:ligatures w14:val="standardContextual"/>
         </w:rPr>
       </w:pPr>
-      <w:hyperlink w:anchor="_Toc240873965" w:history="1">
+      <w:hyperlink w:anchor="_Toc240965943" w:history="1">
         <w:r>
           <w:rPr>
             <w:rStyle w:val="Hyperlink"/>
             <w:noProof/>
             <w:color w:val="auto"/>
           </w:rPr>
-          <w:t>III. QUẢN TRỊ RỦI RO</w:t>
+          <w:t>Phần IV</w:t>
+        </w:r>
+        <w:r>
+          <w:rPr>
+            <w:noProof/>
+            <w:webHidden/>
+            <w:color w:val="auto"/>
+          </w:rPr>
+          <w:t>.</w:t>
+        </w:r>
+      </w:hyperlink>
+      <w:r>
+        <w:rPr>
+          <w:rStyle w:val="Hyperlink"/>
+          <w:noProof/>
+          <w:color w:val="auto"/>
+        </w:rPr>
+        <w:t xml:space="preserve"> </w:t>
+      </w:r>
+      <w:hyperlink w:anchor="_Toc240965944" w:history="1">
+        <w:r>
+          <w:rPr>
+            <w:rStyle w:val="Hyperlink"/>
+            <w:noProof/>
+            <w:color w:val="auto"/>
+          </w:rPr>
+          <w:t>LỘ TRÌNH, CÁC BƯỚC THỰC HIỆN VÀ NHU CẦU KINH PHÍ</w:t>
         </w:r>
         <w:r>
           <w:rPr>
@@ -3125,7 +3224,7 @@
             <w:webHidden/>
             <w:color w:val="auto"/>
           </w:rPr>
-          <w:instrText xml:space="preserve"> PAGEREF _Toc240873965 \h </w:instrText>
+          <w:instrText xml:space="preserve"> PAGEREF _Toc240965944 \h </w:instrText>
         </w:r>
         <w:r>
           <w:rPr>
@@ -3148,7 +3247,7 @@
             <w:webHidden/>
             <w:color w:val="auto"/>
           </w:rPr>
-          <w:t>22</w:t>
+          <w:t>19</w:t>
         </w:r>
         <w:r>
           <w:rPr>
@@ -3162,9 +3261,10 @@
     </w:p>
     <w:p>
       <w:pPr>
-        <w:pStyle w:val="TOC2"/>
+        <w:pStyle w:val="TOC1"/>
         <w:rPr>
           <w:rFonts w:asciiTheme="minorHAnsi" w:eastAsiaTheme="minorEastAsia" w:hAnsiTheme="minorHAnsi" w:cstheme="minorBidi"/>
+          <w:b w:val="0"/>
           <w:noProof/>
           <w:color w:val="auto"/>
           <w:kern w:val="2"/>
@@ -3173,14 +3273,14 @@
           <w14:ligatures w14:val="standardContextual"/>
         </w:rPr>
       </w:pPr>
-      <w:hyperlink w:anchor="_Toc240873966" w:history="1">
+      <w:hyperlink w:anchor="_Toc240965945" w:history="1">
         <w:r>
           <w:rPr>
             <w:rStyle w:val="Hyperlink"/>
             <w:noProof/>
             <w:color w:val="auto"/>
           </w:rPr>
-          <w:t>1. Cấp độ rủi ro</w:t>
+          <w:t>I. LỘ TRÌNH, CÁC BƯỚC THỰC HIỆN</w:t>
         </w:r>
         <w:r>
           <w:rPr>
@@ -3204,7 +3304,7 @@
             <w:webHidden/>
             <w:color w:val="auto"/>
           </w:rPr>
-          <w:instrText xml:space="preserve"> PAGEREF _Toc240873966 \h </w:instrText>
+          <w:instrText xml:space="preserve"> PAGEREF _Toc240965945 \h </w:instrText>
         </w:r>
         <w:r>
           <w:rPr>
@@ -3227,7 +3327,7 @@
             <w:webHidden/>
             <w:color w:val="auto"/>
           </w:rPr>
-          <w:t>22</w:t>
+          <w:t>19</w:t>
         </w:r>
         <w:r>
           <w:rPr>
@@ -3241,9 +3341,10 @@
     </w:p>
     <w:p>
       <w:pPr>
-        <w:pStyle w:val="TOC2"/>
+        <w:pStyle w:val="TOC1"/>
         <w:rPr>
           <w:rFonts w:asciiTheme="minorHAnsi" w:eastAsiaTheme="minorEastAsia" w:hAnsiTheme="minorHAnsi" w:cstheme="minorBidi"/>
+          <w:b w:val="0"/>
           <w:noProof/>
           <w:color w:val="auto"/>
           <w:kern w:val="2"/>
@@ -3252,14 +3353,14 @@
           <w14:ligatures w14:val="standardContextual"/>
         </w:rPr>
       </w:pPr>
-      <w:hyperlink w:anchor="_Toc240873967" w:history="1">
+      <w:hyperlink w:anchor="_Toc240965946" w:history="1">
         <w:r>
           <w:rPr>
             <w:rStyle w:val="Hyperlink"/>
             <w:noProof/>
             <w:color w:val="auto"/>
           </w:rPr>
-          <w:t>2. Cơ chế kiểm soát rủi ro</w:t>
+          <w:t>II. NHU CẦU KINH PHÍ</w:t>
         </w:r>
         <w:r>
           <w:rPr>
@@ -3283,7 +3384,7 @@
             <w:webHidden/>
             <w:color w:val="auto"/>
           </w:rPr>
-          <w:instrText xml:space="preserve"> PAGEREF _Toc240873967 \h </w:instrText>
+          <w:instrText xml:space="preserve"> PAGEREF _Toc240965946 \h </w:instrText>
         </w:r>
         <w:r>
           <w:rPr>
@@ -3306,7 +3407,7 @@
             <w:webHidden/>
             <w:color w:val="auto"/>
           </w:rPr>
-          <w:t>22</w:t>
+          <w:t>19</w:t>
         </w:r>
         <w:r>
           <w:rPr>
@@ -3332,14 +3433,40 @@
           <w14:ligatures w14:val="standardContextual"/>
         </w:rPr>
       </w:pPr>
-      <w:hyperlink w:anchor="_Toc240873968" w:history="1">
+      <w:hyperlink w:anchor="_Toc240965947" w:history="1">
         <w:r>
           <w:rPr>
             <w:rStyle w:val="Hyperlink"/>
             <w:noProof/>
             <w:color w:val="auto"/>
           </w:rPr>
-          <w:t>I. TỔ CHỨC THỰC HIỆN</w:t>
+          <w:t>Phần V</w:t>
+        </w:r>
+        <w:r>
+          <w:rPr>
+            <w:noProof/>
+            <w:webHidden/>
+            <w:color w:val="auto"/>
+          </w:rPr>
+          <w:t>.</w:t>
+        </w:r>
+      </w:hyperlink>
+      <w:r>
+        <w:rPr>
+          <w:rStyle w:val="Hyperlink"/>
+          <w:noProof/>
+          <w:color w:val="auto"/>
+        </w:rPr>
+        <w:t xml:space="preserve"> </w:t>
+      </w:r>
+      <w:hyperlink w:anchor="_Toc240965948" w:history="1">
+        <w:r>
+          <w:rPr>
+            <w:rStyle w:val="Hyperlink"/>
+            <w:noProof/>
+            <w:color w:val="auto"/>
+          </w:rPr>
+          <w:t>HIỆU QUẢ, TÍNH BỀN VỮNG, QUẢN TRỊ RỦI RO</w:t>
         </w:r>
         <w:r>
           <w:rPr>
@@ -3363,7 +3490,7 @@
             <w:webHidden/>
             <w:color w:val="auto"/>
           </w:rPr>
-          <w:instrText xml:space="preserve"> PAGEREF _Toc240873968 \h </w:instrText>
+          <w:instrText xml:space="preserve"> PAGEREF _Toc240965948 \h </w:instrText>
         </w:r>
         <w:r>
           <w:rPr>
@@ -3386,7 +3513,7 @@
             <w:webHidden/>
             <w:color w:val="auto"/>
           </w:rPr>
-          <w:t>25</w:t>
+          <w:t>21</w:t>
         </w:r>
         <w:r>
           <w:rPr>
@@ -3400,9 +3527,10 @@
     </w:p>
     <w:p>
       <w:pPr>
-        <w:pStyle w:val="TOC2"/>
+        <w:pStyle w:val="TOC1"/>
         <w:rPr>
           <w:rFonts w:asciiTheme="minorHAnsi" w:eastAsiaTheme="minorEastAsia" w:hAnsiTheme="minorHAnsi" w:cstheme="minorBidi"/>
+          <w:b w:val="0"/>
           <w:noProof/>
           <w:color w:val="auto"/>
           <w:kern w:val="2"/>
@@ -3411,14 +3539,14 @@
           <w14:ligatures w14:val="standardContextual"/>
         </w:rPr>
       </w:pPr>
-      <w:hyperlink w:anchor="_Toc240873969" w:history="1">
+      <w:hyperlink w:anchor="_Toc240965949" w:history="1">
         <w:r>
           <w:rPr>
             <w:rStyle w:val="Hyperlink"/>
             <w:noProof/>
             <w:color w:val="auto"/>
           </w:rPr>
-          <w:t>1. Trường Cao đẳng Kon Tum</w:t>
+          <w:t>I. HIỆU QUẢ KINH TẾ</w:t>
         </w:r>
         <w:r>
           <w:rPr>
@@ -3442,7 +3570,7 @@
             <w:webHidden/>
             <w:color w:val="auto"/>
           </w:rPr>
-          <w:instrText xml:space="preserve"> PAGEREF _Toc240873969 \h </w:instrText>
+          <w:instrText xml:space="preserve"> PAGEREF _Toc240965949 \h </w:instrText>
         </w:r>
         <w:r>
           <w:rPr>
@@ -3465,7 +3593,7 @@
             <w:webHidden/>
             <w:color w:val="auto"/>
           </w:rPr>
-          <w:t>25</w:t>
+          <w:t>21</w:t>
         </w:r>
         <w:r>
           <w:rPr>
@@ -3479,9 +3607,10 @@
     </w:p>
     <w:p>
       <w:pPr>
-        <w:pStyle w:val="TOC2"/>
+        <w:pStyle w:val="TOC1"/>
         <w:rPr>
           <w:rFonts w:asciiTheme="minorHAnsi" w:eastAsiaTheme="minorEastAsia" w:hAnsiTheme="minorHAnsi" w:cstheme="minorBidi"/>
+          <w:b w:val="0"/>
           <w:noProof/>
           <w:color w:val="auto"/>
           <w:kern w:val="2"/>
@@ -3490,14 +3619,14 @@
           <w14:ligatures w14:val="standardContextual"/>
         </w:rPr>
       </w:pPr>
-      <w:hyperlink w:anchor="_Toc240873970" w:history="1">
+      <w:hyperlink w:anchor="_Toc240965950" w:history="1">
         <w:r>
           <w:rPr>
             <w:rStyle w:val="Hyperlink"/>
             <w:noProof/>
             <w:color w:val="auto"/>
           </w:rPr>
-          <w:t>2. Đề nghị các cơ quan phối hợp thực hiện</w:t>
+          <w:t>II. HIỆU QUẢ XÃ HỘI, MÔI TRƯỜNG, TÍNH BỀN VỮNG</w:t>
         </w:r>
         <w:r>
           <w:rPr>
@@ -3521,7 +3650,7 @@
             <w:webHidden/>
             <w:color w:val="auto"/>
           </w:rPr>
-          <w:instrText xml:space="preserve"> PAGEREF _Toc240873970 \h </w:instrText>
+          <w:instrText xml:space="preserve"> PAGEREF _Toc240965950 \h </w:instrText>
         </w:r>
         <w:r>
           <w:rPr>
@@ -3544,7 +3673,7 @@
             <w:webHidden/>
             <w:color w:val="auto"/>
           </w:rPr>
-          <w:t>25</w:t>
+          <w:t>21</w:t>
         </w:r>
         <w:r>
           <w:rPr>
@@ -3570,13 +3699,595 @@
           <w14:ligatures w14:val="standardContextual"/>
         </w:rPr>
       </w:pPr>
-      <w:hyperlink w:anchor="_Toc240873971" w:history="1">
+      <w:hyperlink w:anchor="_Toc240965951" w:history="1">
         <w:r>
           <w:rPr>
             <w:rStyle w:val="Hyperlink"/>
             <w:noProof/>
             <w:color w:val="auto"/>
           </w:rPr>
+          <w:t>III. QUẢN TRỊ RỦI RO</w:t>
+        </w:r>
+        <w:r>
+          <w:rPr>
+            <w:noProof/>
+            <w:webHidden/>
+            <w:color w:val="auto"/>
+          </w:rPr>
+          <w:tab/>
+        </w:r>
+        <w:r>
+          <w:rPr>
+            <w:noProof/>
+            <w:webHidden/>
+            <w:color w:val="auto"/>
+          </w:rPr>
+          <w:fldChar w:fldCharType="begin"/>
+        </w:r>
+        <w:r>
+          <w:rPr>
+            <w:noProof/>
+            <w:webHidden/>
+            <w:color w:val="auto"/>
+          </w:rPr>
+          <w:instrText xml:space="preserve"> PAGEREF _Toc240965951 \h </w:instrText>
+        </w:r>
+        <w:r>
+          <w:rPr>
+            <w:noProof/>
+            <w:webHidden/>
+            <w:color w:val="auto"/>
+          </w:rPr>
+        </w:r>
+        <w:r>
+          <w:rPr>
+            <w:noProof/>
+            <w:webHidden/>
+            <w:color w:val="auto"/>
+          </w:rPr>
+          <w:fldChar w:fldCharType="separate"/>
+        </w:r>
+        <w:r>
+          <w:rPr>
+            <w:noProof/>
+            <w:webHidden/>
+            <w:color w:val="auto"/>
+          </w:rPr>
+          <w:t>22</w:t>
+        </w:r>
+        <w:r>
+          <w:rPr>
+            <w:noProof/>
+            <w:webHidden/>
+            <w:color w:val="auto"/>
+          </w:rPr>
+          <w:fldChar w:fldCharType="end"/>
+        </w:r>
+      </w:hyperlink>
+    </w:p>
+    <w:p>
+      <w:pPr>
+        <w:pStyle w:val="TOC2"/>
+        <w:rPr>
+          <w:rFonts w:asciiTheme="minorHAnsi" w:eastAsiaTheme="minorEastAsia" w:hAnsiTheme="minorHAnsi" w:cstheme="minorBidi"/>
+          <w:noProof/>
+          <w:color w:val="auto"/>
+          <w:kern w:val="2"/>
+          <w:sz w:val="22"/>
+          <w:szCs w:val="22"/>
+          <w14:ligatures w14:val="standardContextual"/>
+        </w:rPr>
+      </w:pPr>
+      <w:hyperlink w:anchor="_Toc240965952" w:history="1">
+        <w:r>
+          <w:rPr>
+            <w:rStyle w:val="Hyperlink"/>
+            <w:noProof/>
+            <w:color w:val="auto"/>
+          </w:rPr>
+          <w:t>1. Cấp độ rủi ro</w:t>
+        </w:r>
+        <w:r>
+          <w:rPr>
+            <w:noProof/>
+            <w:webHidden/>
+            <w:color w:val="auto"/>
+          </w:rPr>
+          <w:tab/>
+        </w:r>
+        <w:r>
+          <w:rPr>
+            <w:noProof/>
+            <w:webHidden/>
+            <w:color w:val="auto"/>
+          </w:rPr>
+          <w:fldChar w:fldCharType="begin"/>
+        </w:r>
+        <w:r>
+          <w:rPr>
+            <w:noProof/>
+            <w:webHidden/>
+            <w:color w:val="auto"/>
+          </w:rPr>
+          <w:instrText xml:space="preserve"> PAGEREF _Toc240965952 \h </w:instrText>
+        </w:r>
+        <w:r>
+          <w:rPr>
+            <w:noProof/>
+            <w:webHidden/>
+            <w:color w:val="auto"/>
+          </w:rPr>
+        </w:r>
+        <w:r>
+          <w:rPr>
+            <w:noProof/>
+            <w:webHidden/>
+            <w:color w:val="auto"/>
+          </w:rPr>
+          <w:fldChar w:fldCharType="separate"/>
+        </w:r>
+        <w:r>
+          <w:rPr>
+            <w:noProof/>
+            <w:webHidden/>
+            <w:color w:val="auto"/>
+          </w:rPr>
+          <w:t>22</w:t>
+        </w:r>
+        <w:r>
+          <w:rPr>
+            <w:noProof/>
+            <w:webHidden/>
+            <w:color w:val="auto"/>
+          </w:rPr>
+          <w:fldChar w:fldCharType="end"/>
+        </w:r>
+      </w:hyperlink>
+    </w:p>
+    <w:p>
+      <w:pPr>
+        <w:pStyle w:val="TOC2"/>
+        <w:rPr>
+          <w:rFonts w:asciiTheme="minorHAnsi" w:eastAsiaTheme="minorEastAsia" w:hAnsiTheme="minorHAnsi" w:cstheme="minorBidi"/>
+          <w:noProof/>
+          <w:color w:val="auto"/>
+          <w:kern w:val="2"/>
+          <w:sz w:val="22"/>
+          <w:szCs w:val="22"/>
+          <w14:ligatures w14:val="standardContextual"/>
+        </w:rPr>
+      </w:pPr>
+      <w:hyperlink w:anchor="_Toc240965953" w:history="1">
+        <w:r>
+          <w:rPr>
+            <w:rStyle w:val="Hyperlink"/>
+            <w:noProof/>
+            <w:color w:val="auto"/>
+          </w:rPr>
+          <w:t>2. Cơ chế kiểm soát rủi ro</w:t>
+        </w:r>
+        <w:r>
+          <w:rPr>
+            <w:noProof/>
+            <w:webHidden/>
+            <w:color w:val="auto"/>
+          </w:rPr>
+          <w:tab/>
+        </w:r>
+        <w:r>
+          <w:rPr>
+            <w:noProof/>
+            <w:webHidden/>
+            <w:color w:val="auto"/>
+          </w:rPr>
+          <w:fldChar w:fldCharType="begin"/>
+        </w:r>
+        <w:r>
+          <w:rPr>
+            <w:noProof/>
+            <w:webHidden/>
+            <w:color w:val="auto"/>
+          </w:rPr>
+          <w:instrText xml:space="preserve"> PAGEREF _Toc240965953 \h </w:instrText>
+        </w:r>
+        <w:r>
+          <w:rPr>
+            <w:noProof/>
+            <w:webHidden/>
+            <w:color w:val="auto"/>
+          </w:rPr>
+        </w:r>
+        <w:r>
+          <w:rPr>
+            <w:noProof/>
+            <w:webHidden/>
+            <w:color w:val="auto"/>
+          </w:rPr>
+          <w:fldChar w:fldCharType="separate"/>
+        </w:r>
+        <w:r>
+          <w:rPr>
+            <w:noProof/>
+            <w:webHidden/>
+            <w:color w:val="auto"/>
+          </w:rPr>
+          <w:t>22</w:t>
+        </w:r>
+        <w:r>
+          <w:rPr>
+            <w:noProof/>
+            <w:webHidden/>
+            <w:color w:val="auto"/>
+          </w:rPr>
+          <w:fldChar w:fldCharType="end"/>
+        </w:r>
+      </w:hyperlink>
+    </w:p>
+    <w:p>
+      <w:pPr>
+        <w:pStyle w:val="TOC1"/>
+        <w:rPr>
+          <w:rFonts w:asciiTheme="minorHAnsi" w:eastAsiaTheme="minorEastAsia" w:hAnsiTheme="minorHAnsi" w:cstheme="minorBidi"/>
+          <w:b w:val="0"/>
+          <w:noProof/>
+          <w:color w:val="auto"/>
+          <w:kern w:val="2"/>
+          <w:sz w:val="22"/>
+          <w:szCs w:val="22"/>
+          <w14:ligatures w14:val="standardContextual"/>
+        </w:rPr>
+      </w:pPr>
+      <w:hyperlink w:anchor="_Toc240965954" w:history="1">
+        <w:r>
+          <w:rPr>
+            <w:rStyle w:val="Hyperlink"/>
+            <w:noProof/>
+            <w:color w:val="auto"/>
+          </w:rPr>
+          <w:t>Phần VI</w:t>
+        </w:r>
+        <w:r>
+          <w:rPr>
+            <w:noProof/>
+            <w:webHidden/>
+            <w:color w:val="auto"/>
+          </w:rPr>
+          <w:t>.</w:t>
+        </w:r>
+      </w:hyperlink>
+      <w:r>
+        <w:rPr>
+          <w:rStyle w:val="Hyperlink"/>
+          <w:noProof/>
+          <w:color w:val="auto"/>
+        </w:rPr>
+        <w:t xml:space="preserve"> </w:t>
+      </w:r>
+      <w:hyperlink w:anchor="_Toc240965955" w:history="1">
+        <w:r>
+          <w:rPr>
+            <w:rStyle w:val="Hyperlink"/>
+            <w:noProof/>
+            <w:color w:val="auto"/>
+          </w:rPr>
+          <w:t>TỔ CHỨC THỰC HIỆN, KẾT LUẬN VÀ KIẾN NGHỊ</w:t>
+        </w:r>
+        <w:r>
+          <w:rPr>
+            <w:noProof/>
+            <w:webHidden/>
+            <w:color w:val="auto"/>
+          </w:rPr>
+          <w:tab/>
+        </w:r>
+        <w:r>
+          <w:rPr>
+            <w:noProof/>
+            <w:webHidden/>
+            <w:color w:val="auto"/>
+          </w:rPr>
+          <w:fldChar w:fldCharType="begin"/>
+        </w:r>
+        <w:r>
+          <w:rPr>
+            <w:noProof/>
+            <w:webHidden/>
+            <w:color w:val="auto"/>
+          </w:rPr>
+          <w:instrText xml:space="preserve"> PAGEREF _Toc240965955 \h </w:instrText>
+        </w:r>
+        <w:r>
+          <w:rPr>
+            <w:noProof/>
+            <w:webHidden/>
+            <w:color w:val="auto"/>
+          </w:rPr>
+        </w:r>
+        <w:r>
+          <w:rPr>
+            <w:noProof/>
+            <w:webHidden/>
+            <w:color w:val="auto"/>
+          </w:rPr>
+          <w:fldChar w:fldCharType="separate"/>
+        </w:r>
+        <w:r>
+          <w:rPr>
+            <w:noProof/>
+            <w:webHidden/>
+            <w:color w:val="auto"/>
+          </w:rPr>
+          <w:t>25</w:t>
+        </w:r>
+        <w:r>
+          <w:rPr>
+            <w:noProof/>
+            <w:webHidden/>
+            <w:color w:val="auto"/>
+          </w:rPr>
+          <w:fldChar w:fldCharType="end"/>
+        </w:r>
+      </w:hyperlink>
+    </w:p>
+    <w:p>
+      <w:pPr>
+        <w:pStyle w:val="TOC1"/>
+        <w:rPr>
+          <w:rFonts w:asciiTheme="minorHAnsi" w:eastAsiaTheme="minorEastAsia" w:hAnsiTheme="minorHAnsi" w:cstheme="minorBidi"/>
+          <w:b w:val="0"/>
+          <w:noProof/>
+          <w:color w:val="auto"/>
+          <w:kern w:val="2"/>
+          <w:sz w:val="22"/>
+          <w:szCs w:val="22"/>
+          <w14:ligatures w14:val="standardContextual"/>
+        </w:rPr>
+      </w:pPr>
+      <w:hyperlink w:anchor="_Toc240965956" w:history="1">
+        <w:r>
+          <w:rPr>
+            <w:rStyle w:val="Hyperlink"/>
+            <w:noProof/>
+            <w:color w:val="auto"/>
+          </w:rPr>
+          <w:t>I. TỔ CHỨC THỰC HIỆN</w:t>
+        </w:r>
+        <w:r>
+          <w:rPr>
+            <w:noProof/>
+            <w:webHidden/>
+            <w:color w:val="auto"/>
+          </w:rPr>
+          <w:tab/>
+        </w:r>
+        <w:r>
+          <w:rPr>
+            <w:noProof/>
+            <w:webHidden/>
+            <w:color w:val="auto"/>
+          </w:rPr>
+          <w:fldChar w:fldCharType="begin"/>
+        </w:r>
+        <w:r>
+          <w:rPr>
+            <w:noProof/>
+            <w:webHidden/>
+            <w:color w:val="auto"/>
+          </w:rPr>
+          <w:instrText xml:space="preserve"> PAGEREF _Toc240965956 \h </w:instrText>
+        </w:r>
+        <w:r>
+          <w:rPr>
+            <w:noProof/>
+            <w:webHidden/>
+            <w:color w:val="auto"/>
+          </w:rPr>
+        </w:r>
+        <w:r>
+          <w:rPr>
+            <w:noProof/>
+            <w:webHidden/>
+            <w:color w:val="auto"/>
+          </w:rPr>
+          <w:fldChar w:fldCharType="separate"/>
+        </w:r>
+        <w:r>
+          <w:rPr>
+            <w:noProof/>
+            <w:webHidden/>
+            <w:color w:val="auto"/>
+          </w:rPr>
+          <w:t>25</w:t>
+        </w:r>
+        <w:r>
+          <w:rPr>
+            <w:noProof/>
+            <w:webHidden/>
+            <w:color w:val="auto"/>
+          </w:rPr>
+          <w:fldChar w:fldCharType="end"/>
+        </w:r>
+      </w:hyperlink>
+    </w:p>
+    <w:p>
+      <w:pPr>
+        <w:pStyle w:val="TOC2"/>
+        <w:rPr>
+          <w:rFonts w:asciiTheme="minorHAnsi" w:eastAsiaTheme="minorEastAsia" w:hAnsiTheme="minorHAnsi" w:cstheme="minorBidi"/>
+          <w:noProof/>
+          <w:color w:val="auto"/>
+          <w:kern w:val="2"/>
+          <w:sz w:val="22"/>
+          <w:szCs w:val="22"/>
+          <w14:ligatures w14:val="standardContextual"/>
+        </w:rPr>
+      </w:pPr>
+      <w:hyperlink w:anchor="_Toc240965957" w:history="1">
+        <w:r>
+          <w:rPr>
+            <w:rStyle w:val="Hyperlink"/>
+            <w:noProof/>
+            <w:color w:val="auto"/>
+          </w:rPr>
+          <w:t>1. Trường Cao đẳng Kon Tum</w:t>
+        </w:r>
+        <w:r>
+          <w:rPr>
+            <w:noProof/>
+            <w:webHidden/>
+            <w:color w:val="auto"/>
+          </w:rPr>
+          <w:tab/>
+        </w:r>
+        <w:r>
+          <w:rPr>
+            <w:noProof/>
+            <w:webHidden/>
+            <w:color w:val="auto"/>
+          </w:rPr>
+          <w:fldChar w:fldCharType="begin"/>
+        </w:r>
+        <w:r>
+          <w:rPr>
+            <w:noProof/>
+            <w:webHidden/>
+            <w:color w:val="auto"/>
+          </w:rPr>
+          <w:instrText xml:space="preserve"> PAGEREF _Toc240965957 \h </w:instrText>
+        </w:r>
+        <w:r>
+          <w:rPr>
+            <w:noProof/>
+            <w:webHidden/>
+            <w:color w:val="auto"/>
+          </w:rPr>
+        </w:r>
+        <w:r>
+          <w:rPr>
+            <w:noProof/>
+            <w:webHidden/>
+            <w:color w:val="auto"/>
+          </w:rPr>
+          <w:fldChar w:fldCharType="separate"/>
+        </w:r>
+        <w:r>
+          <w:rPr>
+            <w:noProof/>
+            <w:webHidden/>
+            <w:color w:val="auto"/>
+          </w:rPr>
+          <w:t>25</w:t>
+        </w:r>
+        <w:r>
+          <w:rPr>
+            <w:noProof/>
+            <w:webHidden/>
+            <w:color w:val="auto"/>
+          </w:rPr>
+          <w:fldChar w:fldCharType="end"/>
+        </w:r>
+      </w:hyperlink>
+    </w:p>
+    <w:p>
+      <w:pPr>
+        <w:pStyle w:val="TOC2"/>
+        <w:rPr>
+          <w:rFonts w:asciiTheme="minorHAnsi" w:eastAsiaTheme="minorEastAsia" w:hAnsiTheme="minorHAnsi" w:cstheme="minorBidi"/>
+          <w:noProof/>
+          <w:color w:val="auto"/>
+          <w:kern w:val="2"/>
+          <w:sz w:val="22"/>
+          <w:szCs w:val="22"/>
+          <w14:ligatures w14:val="standardContextual"/>
+        </w:rPr>
+      </w:pPr>
+      <w:hyperlink w:anchor="_Toc240965958" w:history="1">
+        <w:r>
+          <w:rPr>
+            <w:rStyle w:val="Hyperlink"/>
+            <w:noProof/>
+            <w:color w:val="auto"/>
+          </w:rPr>
+          <w:t>2. Đề nghị các cơ quan phối hợp thực hiện</w:t>
+        </w:r>
+        <w:r>
+          <w:rPr>
+            <w:noProof/>
+            <w:webHidden/>
+            <w:color w:val="auto"/>
+          </w:rPr>
+          <w:tab/>
+        </w:r>
+        <w:r>
+          <w:rPr>
+            <w:noProof/>
+            <w:webHidden/>
+            <w:color w:val="auto"/>
+          </w:rPr>
+          <w:fldChar w:fldCharType="begin"/>
+        </w:r>
+        <w:r>
+          <w:rPr>
+            <w:noProof/>
+            <w:webHidden/>
+            <w:color w:val="auto"/>
+          </w:rPr>
+          <w:instrText xml:space="preserve"> PAGEREF _Toc240965958 \h </w:instrText>
+        </w:r>
+        <w:r>
+          <w:rPr>
+            <w:noProof/>
+            <w:webHidden/>
+            <w:color w:val="auto"/>
+          </w:rPr>
+        </w:r>
+        <w:r>
+          <w:rPr>
+            <w:noProof/>
+            <w:webHidden/>
+            <w:color w:val="auto"/>
+          </w:rPr>
+          <w:fldChar w:fldCharType="separate"/>
+        </w:r>
+        <w:r>
+          <w:rPr>
+            <w:noProof/>
+            <w:webHidden/>
+            <w:color w:val="auto"/>
+          </w:rPr>
+          <w:t>25</w:t>
+        </w:r>
+        <w:r>
+          <w:rPr>
+            <w:noProof/>
+            <w:webHidden/>
+            <w:color w:val="auto"/>
+          </w:rPr>
+          <w:fldChar w:fldCharType="end"/>
+        </w:r>
+      </w:hyperlink>
+    </w:p>
+    <w:p>
+      <w:pPr>
+        <w:pStyle w:val="TOC1"/>
+        <w:rPr>
+          <w:rFonts w:asciiTheme="minorHAnsi" w:eastAsiaTheme="minorEastAsia" w:hAnsiTheme="minorHAnsi" w:cstheme="minorBidi"/>
+          <w:b w:val="0"/>
+          <w:noProof/>
+          <w:color w:val="auto"/>
+          <w:kern w:val="2"/>
+          <w:sz w:val="22"/>
+          <w:szCs w:val="22"/>
+          <w14:ligatures w14:val="standardContextual"/>
+        </w:rPr>
+      </w:pPr>
+      <w:hyperlink w:anchor="_Toc240965959" w:history="1">
+        <w:r>
+          <w:rPr>
+            <w:rStyle w:val="Hyperlink"/>
+            <w:noProof/>
+            <w:color w:val="auto"/>
+          </w:rPr>
           <w:t>II. KẾT LUẬN VÀ KIẾN NGHỊ</w:t>
         </w:r>
         <w:r>
@@ -3601,7 +4312,7 @@
             <w:webHidden/>
             <w:color w:val="auto"/>
           </w:rPr>
-          <w:instrText xml:space="preserve"> PAGEREF _Toc240873971 \h </w:instrText>
+          <w:instrText xml:space="preserve"> PAGEREF _Toc240965959 \h </w:instrText>
         </w:r>
         <w:r>
           <w:rPr>
@@ -3625,6 +4336,166 @@
             <w:color w:val="auto"/>
           </w:rPr>
           <w:t>26</w:t>
+        </w:r>
+        <w:r>
+          <w:rPr>
+            <w:noProof/>
+            <w:webHidden/>
+            <w:color w:val="auto"/>
+          </w:rPr>
+          <w:fldChar w:fldCharType="end"/>
+        </w:r>
+      </w:hyperlink>
+    </w:p>
+    <w:p>
+      <w:pPr>
+        <w:pStyle w:val="TOC1"/>
+        <w:rPr>
+          <w:rFonts w:asciiTheme="minorHAnsi" w:eastAsiaTheme="minorEastAsia" w:hAnsiTheme="minorHAnsi" w:cstheme="minorBidi"/>
+          <w:b w:val="0"/>
+          <w:noProof/>
+          <w:color w:val="auto"/>
+          <w:kern w:val="2"/>
+          <w:sz w:val="22"/>
+          <w:szCs w:val="22"/>
+          <w14:ligatures w14:val="standardContextual"/>
+        </w:rPr>
+      </w:pPr>
+      <w:hyperlink w:anchor="_Toc240965960" w:history="1">
+        <w:r>
+          <w:rPr>
+            <w:rStyle w:val="Hyperlink"/>
+            <w:noProof/>
+            <w:color w:val="auto"/>
+          </w:rPr>
+          <w:t>TIẾN ĐỘ THỰC HIỆN</w:t>
+        </w:r>
+        <w:r>
+          <w:rPr>
+            <w:noProof/>
+            <w:webHidden/>
+            <w:color w:val="auto"/>
+          </w:rPr>
+          <w:tab/>
+        </w:r>
+        <w:r>
+          <w:rPr>
+            <w:noProof/>
+            <w:webHidden/>
+            <w:color w:val="auto"/>
+          </w:rPr>
+          <w:fldChar w:fldCharType="begin"/>
+        </w:r>
+        <w:r>
+          <w:rPr>
+            <w:noProof/>
+            <w:webHidden/>
+            <w:color w:val="auto"/>
+          </w:rPr>
+          <w:instrText xml:space="preserve"> PAGEREF _Toc240965960 \h </w:instrText>
+        </w:r>
+        <w:r>
+          <w:rPr>
+            <w:noProof/>
+            <w:webHidden/>
+            <w:color w:val="auto"/>
+          </w:rPr>
+        </w:r>
+        <w:r>
+          <w:rPr>
+            <w:noProof/>
+            <w:webHidden/>
+            <w:color w:val="auto"/>
+          </w:rPr>
+          <w:fldChar w:fldCharType="separate"/>
+        </w:r>
+        <w:r>
+          <w:rPr>
+            <w:noProof/>
+            <w:webHidden/>
+            <w:color w:val="auto"/>
+          </w:rPr>
+          <w:t>27</w:t>
+        </w:r>
+        <w:r>
+          <w:rPr>
+            <w:noProof/>
+            <w:webHidden/>
+            <w:color w:val="auto"/>
+          </w:rPr>
+          <w:fldChar w:fldCharType="end"/>
+        </w:r>
+      </w:hyperlink>
+    </w:p>
+    <w:p>
+      <w:pPr>
+        <w:pStyle w:val="TOC1"/>
+        <w:rPr>
+          <w:rFonts w:asciiTheme="minorHAnsi" w:eastAsiaTheme="minorEastAsia" w:hAnsiTheme="minorHAnsi" w:cstheme="minorBidi"/>
+          <w:b w:val="0"/>
+          <w:noProof/>
+          <w:color w:val="auto"/>
+          <w:kern w:val="2"/>
+          <w:sz w:val="22"/>
+          <w:szCs w:val="22"/>
+          <w14:ligatures w14:val="standardContextual"/>
+        </w:rPr>
+      </w:pPr>
+      <w:hyperlink w:anchor="_Toc240965961" w:history="1">
+        <w:r>
+          <w:rPr>
+            <w:rStyle w:val="Hyperlink"/>
+            <w:noProof/>
+            <w:color w:val="auto"/>
+          </w:rPr>
+          <w:t>CÁC PHỤ LỤC</w:t>
+        </w:r>
+        <w:r>
+          <w:rPr>
+            <w:noProof/>
+            <w:webHidden/>
+            <w:color w:val="auto"/>
+          </w:rPr>
+          <w:tab/>
+        </w:r>
+        <w:r>
+          <w:rPr>
+            <w:noProof/>
+            <w:webHidden/>
+            <w:color w:val="auto"/>
+          </w:rPr>
+          <w:fldChar w:fldCharType="begin"/>
+        </w:r>
+        <w:r>
+          <w:rPr>
+            <w:noProof/>
+            <w:webHidden/>
+            <w:color w:val="auto"/>
+          </w:rPr>
+          <w:instrText xml:space="preserve"> PAGEREF _Toc240965961 \h </w:instrText>
+        </w:r>
+        <w:r>
+          <w:rPr>
+            <w:noProof/>
+            <w:webHidden/>
+            <w:color w:val="auto"/>
+          </w:rPr>
+        </w:r>
+        <w:r>
+          <w:rPr>
+            <w:noProof/>
+            <w:webHidden/>
+            <w:color w:val="auto"/>
+          </w:rPr>
+          <w:fldChar w:fldCharType="separate"/>
+        </w:r>
+        <w:r>
+          <w:rPr>
+            <w:noProof/>
+            <w:webHidden/>
+            <w:color w:val="auto"/>
+          </w:rPr>
+          <w:t>28</w:t>
         </w:r>
         <w:r>
           <w:rPr>
@@ -3649,6 +4520,10 @@
         </w:sectPr>
       </w:pPr>
       <w:r>
+        <w:rPr>
+          <w:rFonts w:ascii="Times New Roman Bold" w:hAnsi="Times New Roman Bold"/>
+          <w:b/>
+        </w:rPr>
         <w:fldChar w:fldCharType="end"/>
       </w:r>
     </w:p>
@@ -3660,12 +4535,14 @@
           <w:color w:val="auto"/>
         </w:rPr>
       </w:pPr>
+      <w:bookmarkStart w:id="0" w:name="_Toc240965908"/>
       <w:r>
         <w:rPr>
           <w:color w:val="auto"/>
         </w:rPr>
         <w:t>Phần I</w:t>
       </w:r>
+      <w:bookmarkEnd w:id="0"/>
     </w:p>
     <w:p>
       <w:pPr>
@@ -3674,12 +4551,14 @@
           <w:color w:val="auto"/>
         </w:rPr>
       </w:pPr>
+      <w:bookmarkStart w:id="1" w:name="_Toc240965909"/>
       <w:r>
         <w:rPr>
           <w:color w:val="auto"/>
         </w:rPr>
         <w:t>SỰ CẦN THIẾT, CƠ SỞ XÂY DỰNG ĐỀ ÁN</w:t>
       </w:r>
+      <w:bookmarkEnd w:id="1"/>
     </w:p>
     <w:p>
       <w:pPr>
@@ -3695,14 +4574,14 @@
           <w:color w:val="auto"/>
         </w:rPr>
       </w:pPr>
-      <w:bookmarkStart w:id="0" w:name="_Toc240873933"/>
+      <w:bookmarkStart w:id="2" w:name="_Toc240965910"/>
       <w:r>
         <w:rPr>
           <w:color w:val="auto"/>
         </w:rPr>
         <w:t>I. SỰ CẦN THIẾT</w:t>
       </w:r>
-      <w:bookmarkEnd w:id="0"/>
+      <w:bookmarkEnd w:id="2"/>
     </w:p>
     <w:p>
       <w:r>
@@ -3823,14 +4702,14 @@
           <w:color w:val="auto"/>
         </w:rPr>
       </w:pPr>
-      <w:bookmarkStart w:id="1" w:name="_Toc240873934"/>
+      <w:bookmarkStart w:id="3" w:name="_Toc240965911"/>
       <w:r>
         <w:rPr>
           <w:color w:val="auto"/>
         </w:rPr>
         <w:t>II. CƠ SỞ XÂY DỰNG ĐỀ ÁN</w:t>
       </w:r>
-      <w:bookmarkEnd w:id="1"/>
+      <w:bookmarkEnd w:id="3"/>
     </w:p>
     <w:p>
       <w:pPr>
@@ -3951,6 +4830,12 @@
         <w:rPr>
           <w:color w:val="auto"/>
         </w:rPr>
+        <w:t xml:space="preserve"> </w:t>
+      </w:r>
+      <w:r>
+        <w:rPr>
+          <w:color w:val="auto"/>
+        </w:rPr>
         <w:t>(hợp nhất tại Văn bản hợp nhất số 97/VBHN-VPQH ngày 22 tháng 8 năm 2025);</w:t>
       </w:r>
     </w:p>
@@ -4365,6 +5250,9 @@
     </w:p>
     <w:p>
       <w:r>
+        <w:rPr>
+          <w:color w:val="FF0000"/>
+        </w:rPr>
         <w:t xml:space="preserve">Xét trên các tiêu chí: </w:t>
       </w:r>
       <w:r>
@@ -4382,12 +5270,14 @@
           <w:color w:val="auto"/>
         </w:rPr>
       </w:pPr>
+      <w:bookmarkStart w:id="4" w:name="_Toc240965912"/>
       <w:r>
         <w:rPr>
           <w:color w:val="auto"/>
         </w:rPr>
         <w:t>Phần II</w:t>
       </w:r>
+      <w:bookmarkEnd w:id="4"/>
     </w:p>
     <w:p>
       <w:pPr>
@@ -4396,6 +5286,7 @@
           <w:color w:val="auto"/>
         </w:rPr>
       </w:pPr>
+      <w:bookmarkStart w:id="5" w:name="_Toc240965913"/>
       <w:r>
         <w:rPr>
           <w:color w:val="auto"/>
@@ -4412,7 +5303,14 @@
         <w:rPr>
           <w:color w:val="auto"/>
         </w:rPr>
-        <w:t xml:space="preserve"> ĐÀO TẠO LÁI XE MÔ TÔ </w:t>
+        <w:t xml:space="preserve"> ĐÀO TẠO LÁI XE MÔ TÔ</w:t>
+      </w:r>
+      <w:bookmarkEnd w:id="5"/>
+      <w:r>
+        <w:rPr>
+          <w:color w:val="auto"/>
+        </w:rPr>
+        <w:t xml:space="preserve"> </w:t>
       </w:r>
     </w:p>
     <w:p>
@@ -4422,12 +5320,14 @@
           <w:color w:val="auto"/>
         </w:rPr>
       </w:pPr>
+      <w:bookmarkStart w:id="6" w:name="_Toc240965914"/>
       <w:r>
         <w:rPr>
           <w:color w:val="auto"/>
         </w:rPr>
         <w:t>VÀ CÁC ĐIỀU KIỆN BẢO ĐẢM</w:t>
       </w:r>
+      <w:bookmarkEnd w:id="6"/>
     </w:p>
     <w:p>
       <w:pPr>
@@ -4443,7 +5343,7 @@
           <w:color w:val="auto"/>
         </w:rPr>
       </w:pPr>
-      <w:bookmarkStart w:id="2" w:name="_Toc240873935"/>
+      <w:bookmarkStart w:id="7" w:name="_Toc240965915"/>
       <w:r>
         <w:rPr>
           <w:color w:val="auto"/>
@@ -4462,7 +5362,7 @@
         </w:rPr>
         <w:t xml:space="preserve"> VÀ KẾT QUẢ ĐÀO TẠO, SÁT HẠCH LÁI XE CỦA TRƯỜNG</w:t>
       </w:r>
-      <w:bookmarkEnd w:id="2"/>
+      <w:bookmarkEnd w:id="7"/>
     </w:p>
     <w:p>
       <w:pPr>
@@ -4471,14 +5371,14 @@
           <w:color w:val="auto"/>
         </w:rPr>
       </w:pPr>
-      <w:bookmarkStart w:id="3" w:name="_Toc240873936"/>
+      <w:bookmarkStart w:id="8" w:name="_Toc240965916"/>
       <w:r>
         <w:rPr>
           <w:color w:val="auto"/>
         </w:rPr>
         <w:t>1. Khái quát về khoa ĐT&amp;SHLX</w:t>
       </w:r>
-      <w:bookmarkEnd w:id="3"/>
+      <w:bookmarkEnd w:id="8"/>
     </w:p>
     <w:p>
       <w:r>
@@ -4496,7 +5396,19 @@
     </w:p>
     <w:p>
       <w:r>
-        <w:t>Khoa Đào tạo và Sát hạch lái xe hình thành từ việc đổi tên Trung tâm Thực nghiệm và Cung ứng dịch vụ (thành lập theo Quyết định số 61/QĐ-CĐCĐ ngày 10/01/2018 của Hiệu trưởng Trường Cao đẳng Cộng đồng Kon Tum) theo Quyết định số 596/QĐ-CĐCĐ ngày 28/6/2023 của Hiệu trưởng Trường Cao đẳng Cộng đồng Kon Tum; đặt tại Cơ sở 4, đường Trương Vĩnh Ký, phường Đăk Bla, tỉnh Quảng Ngãi. Từ năm 2018 đến ngày 09/7/2026, Trường đã đào tạo 22.284 học viên lái xe mô tô hạng A1 (Thông báo số 797/TB-CĐKT ngày 09/7/2026 của Trường Cao đẳng Kon Tum).</w:t>
+        <w:t xml:space="preserve">Khoa Đào tạo và Sát hạch lái xe hình thành từ việc đổi tên Trung tâm Thực nghiệm và Cung ứng dịch vụ (thành lập theo Quyết định số 61/QĐ-CĐCĐ ngày 10/01/2018 của Hiệu trưởng Trường Cao đẳng Cộng đồng Kon Tum) theo Quyết định số 596/QĐ-CĐCĐ ngày 28/6/2023 của Hiệu trưởng </w:t>
+      </w:r>
+      <w:r>
+        <w:t>nhà trường</w:t>
+      </w:r>
+      <w:r>
+        <w:t xml:space="preserve">; đặt tại Cơ sở 4, đường Trương Vĩnh Ký, </w:t>
+      </w:r>
+      <w:r>
+        <w:t xml:space="preserve">Tổ 5, </w:t>
+      </w:r>
+      <w:r>
+        <w:t>phường Đăk Bla, tỉnh Quảng Ngãi. Từ năm 2018 đến ngày 09/7/2026, Trường đã đào tạo 22.284 học viên lái xe mô tô hạng A1 (Thông báo số 797/TB-CĐKT ngày 09/7/2026 của Trường Cao đẳng Kon Tum).</w:t>
       </w:r>
     </w:p>
     <w:p>
@@ -4506,7 +5418,19 @@
     </w:p>
     <w:p>
       <w:r>
-        <w:t>Theo Quyết định số 679/QĐ-CĐKT ngày 14/7/2023 của Hiệu trưởng Trường Cao đẳng Kon Tum ban hành Quy định vị trí, chức năng, nhiệm vụ, quyền hạn, cơ cấu tổ chức và mối quan hệ công tác của khoa Đào tạo và Sát hạch lái xe: Khoa là đơn vị chuyên môn thuộc Trường; có chức năng tổ chức, quản lý các hoạt động đào tạo trình độ sơ cấp, đào tạo nghề dưới 3 tháng, dịch vụ sát hạch lái xe và các hoạt động dịch vụ khác; nghiên cứu khoa học và triển khai ứng dụng khoa học, công nghệ (Điều 2).</w:t>
+        <w:t xml:space="preserve">Theo Quyết định số </w:t>
+      </w:r>
+      <w:r>
+        <w:t>2047</w:t>
+      </w:r>
+      <w:r>
+        <w:t xml:space="preserve">/QĐ-CĐKT ngày </w:t>
+      </w:r>
+      <w:r>
+        <w:t>21/9/2026</w:t>
+      </w:r>
+      <w:r>
+        <w:t xml:space="preserve"> của Hiệu trưởng Trường Cao đẳng Kon Tum ban hành Quy định vị trí, chức năng, nhiệm vụ, quyền hạn, cơ cấu tổ chức và mối quan hệ công tác của khoa Đào tạo và Sát hạch lái xe: Khoa là đơn vị chuyên môn thuộc Trường; có chức năng tổ chức, quản lý các hoạt động đào tạo trình độ sơ cấp, đào tạo nghề dưới 3 tháng, dịch vụ sát hạch lái xe và các hoạt động dịch vụ khác; nghiên cứu khoa học và triển khai ứng dụng khoa học, công nghệ (Điều 2).</w:t>
       </w:r>
     </w:p>
     <w:p>
@@ -4575,14 +5499,14 @@
           <w:color w:val="auto"/>
         </w:rPr>
       </w:pPr>
-      <w:bookmarkStart w:id="4" w:name="_Toc240873937"/>
+      <w:bookmarkStart w:id="9" w:name="_Toc240965917"/>
       <w:r>
         <w:rPr>
           <w:color w:val="auto"/>
         </w:rPr>
         <w:t>2. Bộ môn ĐT&amp;SHLX mô tô</w:t>
       </w:r>
-      <w:bookmarkEnd w:id="4"/>
+      <w:bookmarkEnd w:id="9"/>
     </w:p>
     <w:p>
       <w:r>
@@ -4966,14 +5890,14 @@
           <w:color w:val="auto"/>
         </w:rPr>
       </w:pPr>
-      <w:bookmarkStart w:id="5" w:name="_Toc240873938"/>
+      <w:bookmarkStart w:id="10" w:name="_Toc240965918"/>
       <w:r>
         <w:rPr>
           <w:color w:val="auto"/>
         </w:rPr>
         <w:t>3. Kết quả tuyển sinh, đào tạo, sát hạch lái xe</w:t>
       </w:r>
-      <w:bookmarkEnd w:id="5"/>
+      <w:bookmarkEnd w:id="10"/>
     </w:p>
     <w:p>
       <w:pPr>
@@ -4997,7 +5921,7 @@
           <w:color w:val="auto"/>
         </w:rPr>
       </w:pPr>
-      <w:bookmarkStart w:id="6" w:name="_Toc238544013"/>
+      <w:bookmarkStart w:id="11" w:name="_Toc238544013"/>
       <w:r>
         <w:rPr>
           <w:color w:val="auto"/>
@@ -5016,7 +5940,7 @@
         </w:rPr>
         <w:t>. Kết quả tuyển sinh, đào tạo Lái xe ô tô giai đoạn 2023-202</w:t>
       </w:r>
-      <w:bookmarkEnd w:id="6"/>
+      <w:bookmarkEnd w:id="11"/>
       <w:r>
         <w:rPr>
           <w:color w:val="auto"/>
@@ -6069,7 +6993,7 @@
           <w:color w:val="auto"/>
         </w:rPr>
       </w:pPr>
-      <w:bookmarkStart w:id="7" w:name="_Hlk240716709"/>
+      <w:bookmarkStart w:id="12" w:name="_Hlk240716709"/>
       <w:r>
         <w:rPr>
           <w:color w:val="auto"/>
@@ -6425,7 +7349,7 @@
           </w:p>
         </w:tc>
       </w:tr>
-      <w:bookmarkEnd w:id="7"/>
+      <w:bookmarkEnd w:id="12"/>
       <w:tr>
         <w:trPr>
           <w:cantSplit/>
@@ -7448,14 +8372,14 @@
           <w:color w:val="auto"/>
         </w:rPr>
       </w:pPr>
-      <w:bookmarkStart w:id="8" w:name="_Toc240873939"/>
+      <w:bookmarkStart w:id="13" w:name="_Toc240965919"/>
       <w:r>
         <w:rPr>
           <w:color w:val="auto"/>
         </w:rPr>
         <w:t>4. Kết quả thu, chi hoạt động lái xe của Trường giai đoạn 2023-2025</w:t>
       </w:r>
-      <w:bookmarkEnd w:id="8"/>
+      <w:bookmarkEnd w:id="13"/>
     </w:p>
     <w:p>
       <w:pPr>
@@ -7464,7 +8388,7 @@
           <w:color w:val="auto"/>
         </w:rPr>
       </w:pPr>
-      <w:bookmarkStart w:id="9" w:name="_Toc238544016"/>
+      <w:bookmarkStart w:id="14" w:name="_Toc238544016"/>
       <w:r>
         <w:rPr>
           <w:color w:val="auto"/>
@@ -7483,7 +8407,7 @@
         </w:rPr>
         <w:t>. Kết quả thu, chi tài chính hoạt động đào tạo, sát hạch lái xe của Trường giai đoạn 2023-2025</w:t>
       </w:r>
-      <w:bookmarkEnd w:id="9"/>
+      <w:bookmarkEnd w:id="14"/>
     </w:p>
     <w:p>
       <w:pPr>
@@ -9175,7 +10099,7 @@
           <w:color w:val="auto"/>
         </w:rPr>
       </w:pPr>
-      <w:bookmarkStart w:id="10" w:name="_Toc240873940"/>
+      <w:bookmarkStart w:id="15" w:name="_Toc240965920"/>
       <w:r>
         <w:rPr>
           <w:color w:val="auto"/>
@@ -9188,7 +10112,7 @@
         </w:rPr>
         <w:t xml:space="preserve"> CỦA TRƯỜNG</w:t>
       </w:r>
-      <w:bookmarkEnd w:id="10"/>
+      <w:bookmarkEnd w:id="15"/>
     </w:p>
     <w:p>
       <w:pPr>
@@ -9197,14 +10121,14 @@
           <w:color w:val="auto"/>
         </w:rPr>
       </w:pPr>
-      <w:bookmarkStart w:id="11" w:name="_Toc240873941"/>
+      <w:bookmarkStart w:id="16" w:name="_Toc240965921"/>
       <w:r>
         <w:rPr>
           <w:color w:val="auto"/>
         </w:rPr>
         <w:t>1. Về sân tập, sân sát hạch</w:t>
       </w:r>
-      <w:bookmarkEnd w:id="11"/>
+      <w:bookmarkEnd w:id="16"/>
     </w:p>
     <w:p>
       <w:r>
@@ -9255,14 +10179,14 @@
           <w:color w:val="auto"/>
         </w:rPr>
       </w:pPr>
-      <w:bookmarkStart w:id="12" w:name="_Toc240873942"/>
+      <w:bookmarkStart w:id="17" w:name="_Toc240965922"/>
       <w:r>
         <w:rPr>
           <w:color w:val="auto"/>
         </w:rPr>
         <w:t>2. Về phương tiện</w:t>
       </w:r>
-      <w:bookmarkEnd w:id="12"/>
+      <w:bookmarkEnd w:id="17"/>
     </w:p>
     <w:p>
       <w:r>
@@ -9287,14 +10211,14 @@
           <w:color w:val="auto"/>
         </w:rPr>
       </w:pPr>
-      <w:bookmarkStart w:id="13" w:name="_Toc240873943"/>
+      <w:bookmarkStart w:id="18" w:name="_Toc240965923"/>
       <w:r>
         <w:rPr>
           <w:color w:val="auto"/>
         </w:rPr>
         <w:t>3. Về phòng học, trang thiết bị giảng dạy lý thuyết</w:t>
       </w:r>
-      <w:bookmarkEnd w:id="13"/>
+      <w:bookmarkEnd w:id="18"/>
     </w:p>
     <w:p>
       <w:r>
@@ -9967,7 +10891,7 @@
           <w:color w:val="auto"/>
         </w:rPr>
       </w:pPr>
-      <w:bookmarkStart w:id="14" w:name="_Toc240873944"/>
+      <w:bookmarkStart w:id="19" w:name="_Toc240965924"/>
       <w:r>
         <w:rPr>
           <w:color w:val="auto"/>
@@ -9998,7 +10922,7 @@
         </w:rPr>
         <w:t>HẠNG A</w:t>
       </w:r>
-      <w:bookmarkEnd w:id="14"/>
+      <w:bookmarkEnd w:id="19"/>
     </w:p>
     <w:p>
       <w:r>
@@ -10036,14 +10960,14 @@
           <w:color w:val="auto"/>
         </w:rPr>
       </w:pPr>
-      <w:bookmarkStart w:id="15" w:name="_Toc240873945"/>
+      <w:bookmarkStart w:id="20" w:name="_Toc240965925"/>
       <w:r>
         <w:rPr>
           <w:color w:val="auto"/>
         </w:rPr>
         <w:t>IV. ĐÁNH GIÁ CHUNG</w:t>
       </w:r>
-      <w:bookmarkEnd w:id="15"/>
+      <w:bookmarkEnd w:id="20"/>
     </w:p>
     <w:p>
       <w:pPr>
@@ -10052,14 +10976,14 @@
           <w:color w:val="auto"/>
         </w:rPr>
       </w:pPr>
-      <w:bookmarkStart w:id="16" w:name="_Toc240873946"/>
+      <w:bookmarkStart w:id="21" w:name="_Toc240965926"/>
       <w:r>
         <w:rPr>
           <w:color w:val="auto"/>
         </w:rPr>
         <w:t>1. Ưu điểm, kết quả và những thuận lợi</w:t>
       </w:r>
-      <w:bookmarkEnd w:id="16"/>
+      <w:bookmarkEnd w:id="21"/>
     </w:p>
     <w:p>
       <w:r>
@@ -10082,14 +11006,14 @@
           <w:color w:val="auto"/>
         </w:rPr>
       </w:pPr>
-      <w:bookmarkStart w:id="17" w:name="_Toc240873947"/>
+      <w:bookmarkStart w:id="22" w:name="_Toc240965927"/>
       <w:r>
         <w:rPr>
           <w:color w:val="auto"/>
         </w:rPr>
         <w:t>2. Những hạn chế, khó khăn và nguyên nhân</w:t>
       </w:r>
-      <w:bookmarkEnd w:id="17"/>
+      <w:bookmarkEnd w:id="22"/>
     </w:p>
     <w:p>
       <w:r>
@@ -10184,12 +11108,14 @@
           <w:color w:val="auto"/>
         </w:rPr>
       </w:pPr>
+      <w:bookmarkStart w:id="23" w:name="_Toc240965928"/>
       <w:r>
         <w:rPr>
           <w:color w:val="auto"/>
         </w:rPr>
         <w:t>Phần III</w:t>
       </w:r>
+      <w:bookmarkEnd w:id="23"/>
     </w:p>
     <w:p>
       <w:pPr>
@@ -10198,6 +11124,7 @@
           <w:color w:val="auto"/>
         </w:rPr>
       </w:pPr>
+      <w:bookmarkStart w:id="24" w:name="_Toc240965929"/>
       <w:r>
         <w:rPr>
           <w:color w:val="auto"/>
@@ -10216,6 +11143,7 @@
         </w:rPr>
         <w:t xml:space="preserve"> ĐỀ ÁN</w:t>
       </w:r>
+      <w:bookmarkEnd w:id="24"/>
     </w:p>
     <w:p>
       <w:pPr>
@@ -10231,14 +11159,14 @@
           <w:color w:val="auto"/>
         </w:rPr>
       </w:pPr>
-      <w:bookmarkStart w:id="18" w:name="_Toc240873948"/>
+      <w:bookmarkStart w:id="25" w:name="_Toc240965930"/>
       <w:r>
         <w:rPr>
           <w:color w:val="auto"/>
         </w:rPr>
         <w:t>I. MỤC TIÊU, QUAN ĐIỂM</w:t>
       </w:r>
-      <w:bookmarkEnd w:id="18"/>
+      <w:bookmarkEnd w:id="25"/>
     </w:p>
     <w:p>
       <w:pPr>
@@ -10247,14 +11175,14 @@
           <w:color w:val="auto"/>
         </w:rPr>
       </w:pPr>
-      <w:bookmarkStart w:id="19" w:name="_Toc240873949"/>
+      <w:bookmarkStart w:id="26" w:name="_Toc240965931"/>
       <w:r>
         <w:rPr>
           <w:color w:val="auto"/>
         </w:rPr>
         <w:t>1. Mục tiêu chung</w:t>
       </w:r>
-      <w:bookmarkEnd w:id="19"/>
+      <w:bookmarkEnd w:id="26"/>
     </w:p>
     <w:p>
       <w:r>
@@ -10278,14 +11206,14 @@
           <w:color w:val="auto"/>
         </w:rPr>
       </w:pPr>
-      <w:bookmarkStart w:id="20" w:name="_Toc240873950"/>
+      <w:bookmarkStart w:id="27" w:name="_Toc240965932"/>
       <w:r>
         <w:rPr>
           <w:color w:val="auto"/>
         </w:rPr>
         <w:t>2. Mục tiêu cụ thể</w:t>
       </w:r>
-      <w:bookmarkEnd w:id="20"/>
+      <w:bookmarkEnd w:id="27"/>
     </w:p>
     <w:p>
       <w:r>
@@ -10351,14 +11279,14 @@
           <w:color w:val="auto"/>
         </w:rPr>
       </w:pPr>
-      <w:bookmarkStart w:id="21" w:name="_Toc240873951"/>
+      <w:bookmarkStart w:id="28" w:name="_Toc240965933"/>
       <w:r>
         <w:rPr>
           <w:color w:val="auto"/>
         </w:rPr>
         <w:t>3. Quan điểm xây dựng Đề án</w:t>
       </w:r>
-      <w:bookmarkEnd w:id="21"/>
+      <w:bookmarkEnd w:id="28"/>
     </w:p>
     <w:p>
       <w:r>
@@ -10372,14 +11300,14 @@
           <w:color w:val="auto"/>
         </w:rPr>
       </w:pPr>
-      <w:bookmarkStart w:id="22" w:name="_Toc240873952"/>
+      <w:bookmarkStart w:id="29" w:name="_Toc240965934"/>
       <w:r>
         <w:rPr>
           <w:color w:val="auto"/>
         </w:rPr>
         <w:t>4. Mục tiêu tuyển sinh, quy mô đào tạo dự kiến theo năm (từ 2027)</w:t>
       </w:r>
-      <w:bookmarkEnd w:id="22"/>
+      <w:bookmarkEnd w:id="29"/>
       <w:r>
         <w:rPr>
           <w:color w:val="auto"/>
@@ -11415,7 +12343,7 @@
           <w:color w:val="auto"/>
         </w:rPr>
       </w:pPr>
-      <w:bookmarkStart w:id="23" w:name="_Toc240873953"/>
+      <w:bookmarkStart w:id="30" w:name="_Toc240965935"/>
       <w:r>
         <w:rPr>
           <w:color w:val="auto"/>
@@ -11434,7 +12362,7 @@
         </w:rPr>
         <w:t xml:space="preserve"> CHỨC NĂNG, NHIỆM VỤ, TỔ CHỨC NHÂN SỰ</w:t>
       </w:r>
-      <w:bookmarkEnd w:id="23"/>
+      <w:bookmarkEnd w:id="30"/>
     </w:p>
     <w:p>
       <w:pPr>
@@ -11443,14 +12371,14 @@
           <w:color w:val="auto"/>
         </w:rPr>
       </w:pPr>
-      <w:bookmarkStart w:id="24" w:name="_Toc240873954"/>
+      <w:bookmarkStart w:id="31" w:name="_Toc240965936"/>
       <w:r>
         <w:rPr>
           <w:color w:val="auto"/>
         </w:rPr>
         <w:t>1. Đơn vị/bộ môn chủ trì thực hiện</w:t>
       </w:r>
-      <w:bookmarkEnd w:id="24"/>
+      <w:bookmarkEnd w:id="31"/>
     </w:p>
     <w:p>
       <w:r>
@@ -11464,14 +12392,14 @@
           <w:color w:val="auto"/>
         </w:rPr>
       </w:pPr>
-      <w:bookmarkStart w:id="25" w:name="_Toc240873955"/>
+      <w:bookmarkStart w:id="32" w:name="_Toc240965937"/>
       <w:r>
         <w:rPr>
           <w:color w:val="auto"/>
         </w:rPr>
         <w:t>2. Về nhân sự</w:t>
       </w:r>
-      <w:bookmarkEnd w:id="25"/>
+      <w:bookmarkEnd w:id="32"/>
     </w:p>
     <w:p>
       <w:r>
@@ -11506,14 +12434,14 @@
           <w:color w:val="auto"/>
         </w:rPr>
       </w:pPr>
-      <w:bookmarkStart w:id="26" w:name="_Toc240873956"/>
+      <w:bookmarkStart w:id="33" w:name="_Toc240965938"/>
       <w:r>
         <w:rPr>
           <w:color w:val="auto"/>
         </w:rPr>
         <w:t>III. ĐỊA ĐIỂM ĐẦU TƯ</w:t>
       </w:r>
-      <w:bookmarkEnd w:id="26"/>
+      <w:bookmarkEnd w:id="33"/>
     </w:p>
     <w:p>
       <w:r>
@@ -11527,7 +12455,7 @@
           <w:color w:val="auto"/>
         </w:rPr>
       </w:pPr>
-      <w:bookmarkStart w:id="27" w:name="_Toc240873957"/>
+      <w:bookmarkStart w:id="34" w:name="_Toc240965939"/>
       <w:r>
         <w:rPr>
           <w:color w:val="auto"/>
@@ -11546,7 +12474,7 @@
         </w:rPr>
         <w:t>, PHƯƠNG TIỆN, THIẾT BỊ</w:t>
       </w:r>
-      <w:bookmarkEnd w:id="27"/>
+      <w:bookmarkEnd w:id="34"/>
     </w:p>
     <w:p>
       <w:pPr>
@@ -11555,14 +12483,14 @@
           <w:color w:val="auto"/>
         </w:rPr>
       </w:pPr>
-      <w:bookmarkStart w:id="28" w:name="_Toc240873958"/>
+      <w:bookmarkStart w:id="35" w:name="_Toc240965940"/>
       <w:r>
         <w:rPr>
           <w:color w:val="auto"/>
         </w:rPr>
         <w:t>1. Sân tập, sân sát hạch</w:t>
       </w:r>
-      <w:bookmarkEnd w:id="28"/>
+      <w:bookmarkEnd w:id="35"/>
     </w:p>
     <w:p>
       <w:r>
@@ -11591,7 +12519,7 @@
           <w:color w:val="auto"/>
         </w:rPr>
       </w:pPr>
-      <w:bookmarkStart w:id="29" w:name="_Toc240873959"/>
+      <w:bookmarkStart w:id="36" w:name="_Toc240965941"/>
       <w:r>
         <w:rPr>
           <w:color w:val="auto"/>
@@ -11610,7 +12538,7 @@
         </w:rPr>
         <w:t>:</w:t>
       </w:r>
-      <w:bookmarkEnd w:id="29"/>
+      <w:bookmarkEnd w:id="36"/>
       <w:r>
         <w:rPr>
           <w:color w:val="auto"/>
@@ -12276,7 +13204,7 @@
           <w:color w:val="auto"/>
         </w:rPr>
       </w:pPr>
-      <w:bookmarkStart w:id="30" w:name="_Toc240873960"/>
+      <w:bookmarkStart w:id="37" w:name="_Toc240965942"/>
       <w:r>
         <w:rPr>
           <w:color w:val="auto"/>
@@ -12289,7 +13217,7 @@
         </w:rPr>
         <w:t>CƠ CHẾ HOẠT ĐỘNG, QUẢN LÝ TÀI CHÍNH</w:t>
       </w:r>
-      <w:bookmarkEnd w:id="30"/>
+      <w:bookmarkEnd w:id="37"/>
     </w:p>
     <w:p>
       <w:r>
@@ -12349,12 +13277,14 @@
           <w:color w:val="auto"/>
         </w:rPr>
       </w:pPr>
+      <w:bookmarkStart w:id="38" w:name="_Toc240965943"/>
       <w:r>
         <w:rPr>
           <w:color w:val="auto"/>
         </w:rPr>
         <w:t>Phần IV</w:t>
       </w:r>
+      <w:bookmarkEnd w:id="38"/>
     </w:p>
     <w:p>
       <w:pPr>
@@ -12363,12 +13293,14 @@
           <w:color w:val="auto"/>
         </w:rPr>
       </w:pPr>
+      <w:bookmarkStart w:id="39" w:name="_Toc240965944"/>
       <w:r>
         <w:rPr>
           <w:color w:val="auto"/>
         </w:rPr>
         <w:t>LỘ TRÌNH, CÁC BƯỚC THỰC HIỆN VÀ NHU CẦU KINH PHÍ</w:t>
       </w:r>
+      <w:bookmarkEnd w:id="39"/>
     </w:p>
     <w:p>
       <w:pPr>
@@ -12386,14 +13318,14 @@
           <w:color w:val="auto"/>
         </w:rPr>
       </w:pPr>
-      <w:bookmarkStart w:id="31" w:name="_Toc240873961"/>
+      <w:bookmarkStart w:id="40" w:name="_Toc240965945"/>
       <w:r>
         <w:rPr>
           <w:color w:val="auto"/>
         </w:rPr>
         <w:t>I. LỘ TRÌNH, CÁC BƯỚC THỰC HIỆN</w:t>
       </w:r>
-      <w:bookmarkEnd w:id="31"/>
+      <w:bookmarkEnd w:id="40"/>
     </w:p>
     <w:p>
       <w:r>
@@ -12430,14 +13362,14 @@
           <w:color w:val="auto"/>
         </w:rPr>
       </w:pPr>
-      <w:bookmarkStart w:id="32" w:name="_Toc240873962"/>
+      <w:bookmarkStart w:id="41" w:name="_Toc240965946"/>
       <w:r>
         <w:rPr>
           <w:color w:val="auto"/>
         </w:rPr>
         <w:t>II. NHU CẦU KINH PHÍ</w:t>
       </w:r>
-      <w:bookmarkEnd w:id="32"/>
+      <w:bookmarkEnd w:id="41"/>
     </w:p>
     <w:p>
       <w:r>
@@ -12889,12 +13821,14 @@
           <w:color w:val="auto"/>
         </w:rPr>
       </w:pPr>
+      <w:bookmarkStart w:id="42" w:name="_Toc240965947"/>
       <w:r>
         <w:rPr>
           <w:color w:val="auto"/>
         </w:rPr>
         <w:t>Phần V</w:t>
       </w:r>
+      <w:bookmarkEnd w:id="42"/>
     </w:p>
     <w:p>
       <w:pPr>
@@ -12903,12 +13837,14 @@
           <w:color w:val="auto"/>
         </w:rPr>
       </w:pPr>
+      <w:bookmarkStart w:id="43" w:name="_Toc240965948"/>
       <w:r>
         <w:rPr>
           <w:color w:val="auto"/>
         </w:rPr>
         <w:t>HIỆU QUẢ, TÍNH BỀN VỮNG, QUẢN TRỊ RỦI RO</w:t>
       </w:r>
+      <w:bookmarkEnd w:id="43"/>
     </w:p>
     <w:p>
       <w:pPr>
@@ -12924,14 +13860,14 @@
           <w:color w:val="auto"/>
         </w:rPr>
       </w:pPr>
-      <w:bookmarkStart w:id="33" w:name="_Toc240873963"/>
+      <w:bookmarkStart w:id="44" w:name="_Toc240965949"/>
       <w:r>
         <w:rPr>
           <w:color w:val="auto"/>
         </w:rPr>
         <w:t>I. HIỆU QUẢ KINH TẾ</w:t>
       </w:r>
-      <w:bookmarkEnd w:id="33"/>
+      <w:bookmarkEnd w:id="44"/>
     </w:p>
     <w:p>
       <w:r>
@@ -13152,14 +14088,14 @@
           <w:color w:val="auto"/>
         </w:rPr>
       </w:pPr>
-      <w:bookmarkStart w:id="34" w:name="_Toc240873964"/>
+      <w:bookmarkStart w:id="45" w:name="_Toc240965950"/>
       <w:r>
         <w:rPr>
           <w:color w:val="auto"/>
         </w:rPr>
         <w:t>II. HIỆU QUẢ XÃ HỘI, MÔI TRƯỜNG, TÍNH BỀN VỮNG</w:t>
       </w:r>
-      <w:bookmarkEnd w:id="34"/>
+      <w:bookmarkEnd w:id="45"/>
     </w:p>
     <w:p>
       <w:r>
@@ -13214,14 +14150,14 @@
           <w:color w:val="auto"/>
         </w:rPr>
       </w:pPr>
-      <w:bookmarkStart w:id="35" w:name="_Toc240873965"/>
+      <w:bookmarkStart w:id="46" w:name="_Toc240965951"/>
       <w:r>
         <w:rPr>
           <w:color w:val="auto"/>
         </w:rPr>
         <w:t>III. QUẢN TRỊ RỦI RO</w:t>
       </w:r>
-      <w:bookmarkEnd w:id="35"/>
+      <w:bookmarkEnd w:id="46"/>
     </w:p>
     <w:p>
       <w:pPr>
@@ -13230,14 +14166,14 @@
           <w:color w:val="auto"/>
         </w:rPr>
       </w:pPr>
-      <w:bookmarkStart w:id="36" w:name="_Toc240873966"/>
+      <w:bookmarkStart w:id="47" w:name="_Toc240965952"/>
       <w:r>
         <w:rPr>
           <w:color w:val="auto"/>
         </w:rPr>
         <w:t>1. Cấp độ rủi ro</w:t>
       </w:r>
-      <w:bookmarkEnd w:id="36"/>
+      <w:bookmarkEnd w:id="47"/>
     </w:p>
     <w:p>
       <w:r>
@@ -13415,14 +14351,14 @@
           <w:color w:val="auto"/>
         </w:rPr>
       </w:pPr>
-      <w:bookmarkStart w:id="37" w:name="_Toc240873967"/>
+      <w:bookmarkStart w:id="48" w:name="_Toc240965953"/>
       <w:r>
         <w:rPr>
           <w:color w:val="auto"/>
         </w:rPr>
         <w:t>2. Cơ chế kiểm soát rủi ro</w:t>
       </w:r>
-      <w:bookmarkEnd w:id="37"/>
+      <w:bookmarkEnd w:id="48"/>
     </w:p>
     <w:p>
       <w:pPr>
@@ -14263,12 +15199,14 @@
           <w:color w:val="auto"/>
         </w:rPr>
       </w:pPr>
+      <w:bookmarkStart w:id="49" w:name="_Toc240965954"/>
       <w:r>
         <w:rPr>
           <w:color w:val="auto"/>
         </w:rPr>
         <w:t>Phần VI</w:t>
       </w:r>
+      <w:bookmarkEnd w:id="49"/>
     </w:p>
     <w:p>
       <w:pPr>
@@ -14277,12 +15215,14 @@
           <w:color w:val="auto"/>
         </w:rPr>
       </w:pPr>
+      <w:bookmarkStart w:id="50" w:name="_Toc240965955"/>
       <w:r>
         <w:rPr>
           <w:color w:val="auto"/>
         </w:rPr>
         <w:t>TỔ CHỨC THỰC HIỆN, KẾT LUẬN VÀ KIẾN NGHỊ</w:t>
       </w:r>
+      <w:bookmarkEnd w:id="50"/>
     </w:p>
     <w:p>
       <w:pPr>
@@ -14300,14 +15240,14 @@
           <w:color w:val="auto"/>
         </w:rPr>
       </w:pPr>
-      <w:bookmarkStart w:id="38" w:name="_Toc240873968"/>
+      <w:bookmarkStart w:id="51" w:name="_Toc240965956"/>
       <w:r>
         <w:rPr>
           <w:color w:val="auto"/>
         </w:rPr>
         <w:t>I. TỔ CHỨC THỰC HIỆN</w:t>
       </w:r>
-      <w:bookmarkEnd w:id="38"/>
+      <w:bookmarkEnd w:id="51"/>
     </w:p>
     <w:p>
       <w:pPr>
@@ -14316,14 +15256,14 @@
           <w:color w:val="auto"/>
         </w:rPr>
       </w:pPr>
-      <w:bookmarkStart w:id="39" w:name="_Toc240873969"/>
+      <w:bookmarkStart w:id="52" w:name="_Toc240965957"/>
       <w:r>
         <w:rPr>
           <w:color w:val="auto"/>
         </w:rPr>
         <w:t>1. Trường Cao đẳng Kon Tum</w:t>
       </w:r>
-      <w:bookmarkEnd w:id="39"/>
+      <w:bookmarkEnd w:id="52"/>
     </w:p>
     <w:p>
       <w:pPr>
@@ -14477,14 +15417,14 @@
           <w:color w:val="auto"/>
         </w:rPr>
       </w:pPr>
-      <w:bookmarkStart w:id="40" w:name="_Toc240873970"/>
+      <w:bookmarkStart w:id="53" w:name="_Toc240965958"/>
       <w:r>
         <w:rPr>
           <w:color w:val="auto"/>
         </w:rPr>
         <w:t>2. Đề nghị các cơ quan phối hợp thực hiện</w:t>
       </w:r>
-      <w:bookmarkEnd w:id="40"/>
+      <w:bookmarkEnd w:id="53"/>
     </w:p>
     <w:p>
       <w:r>
@@ -14522,14 +15462,14 @@
           <w:color w:val="auto"/>
         </w:rPr>
       </w:pPr>
-      <w:bookmarkStart w:id="41" w:name="_Toc240873971"/>
+      <w:bookmarkStart w:id="54" w:name="_Toc240965959"/>
       <w:r>
         <w:rPr>
           <w:color w:val="auto"/>
         </w:rPr>
         <w:t>II. KẾT LUẬN VÀ KIẾN NGHỊ</w:t>
       </w:r>
-      <w:bookmarkEnd w:id="41"/>
+      <w:bookmarkEnd w:id="54"/>
     </w:p>
     <w:p>
       <w:r>
@@ -14559,12 +15499,14 @@
           <w:color w:val="auto"/>
         </w:rPr>
       </w:pPr>
+      <w:bookmarkStart w:id="55" w:name="_Toc240965960"/>
       <w:r>
         <w:rPr>
           <w:color w:val="auto"/>
         </w:rPr>
         <w:t>TIẾN ĐỘ THỰC HIỆN</w:t>
       </w:r>
+      <w:bookmarkEnd w:id="55"/>
     </w:p>
     <w:p>
       <w:r>
@@ -14697,7 +15639,13 @@
               <w:jc w:val="center"/>
             </w:pPr>
             <w:r>
-              <w:t>15/9 - 21/9/2026</w:t>
+              <w:t>15/9 - 2</w:t>
+            </w:r>
+            <w:r>
+              <w:t>2</w:t>
+            </w:r>
+            <w:r>
+              <w:t>/9/2026</w:t>
             </w:r>
           </w:p>
         </w:tc>
@@ -15110,12 +16058,14 @@
           <w:color w:val="FF0000"/>
         </w:rPr>
       </w:pPr>
+      <w:bookmarkStart w:id="56" w:name="_Toc240965961"/>
       <w:r>
         <w:rPr>
           <w:color w:val="FF0000"/>
         </w:rPr>
         <w:t>CÁC PHỤ LỤC</w:t>
       </w:r>
+      <w:bookmarkEnd w:id="56"/>
     </w:p>
     <w:p>
       <w:pPr>

</xml_diff>